<commit_message>
first commit with uni email
</commit_message>
<xml_diff>
--- a/week4/Stage_1_Lab_Student_Handout.docx
+++ b/week4/Stage_1_Lab_Student_Handout.docx
@@ -1,6 +1,6 @@
 
 <file path=word/document.xml><?xml version="1.0" encoding="utf-8"?>
-<w:document xmlns:wpc="http://schemas.microsoft.com/office/word/2010/wordprocessingCanvas" xmlns:cx="http://schemas.microsoft.com/office/drawing/2014/chartex" xmlns:cx1="http://schemas.microsoft.com/office/drawing/2015/9/8/chartex" xmlns:cx2="http://schemas.microsoft.com/office/drawing/2015/10/21/chartex" xmlns:cx3="http://schemas.microsoft.com/office/drawing/2016/5/9/chartex" xmlns:cx4="http://schemas.microsoft.com/office/drawing/2016/5/10/chartex" xmlns:cx5="http://schemas.microsoft.com/office/drawing/2016/5/11/chartex" xmlns:cx6="http://schemas.microsoft.com/office/drawing/2016/5/12/chartex" xmlns:cx7="http://schemas.microsoft.com/office/drawing/2016/5/13/chartex" xmlns:cx8="http://schemas.microsoft.com/office/drawing/2016/5/14/chartex" xmlns:mc="http://schemas.openxmlformats.org/markup-compatibility/2006" xmlns:aink="http://schemas.microsoft.com/office/drawing/2016/ink" xmlns:am3d="http://schemas.microsoft.com/office/drawing/2017/model3d" xmlns:o="urn:schemas-microsoft-com:office:office" xmlns:oel="http://schemas.microsoft.com/office/2019/extlst" xmlns:r="http://schemas.openxmlformats.org/officeDocument/2006/relationships" xmlns:m="http://schemas.openxmlformats.org/officeDocument/2006/math" xmlns:v="urn:schemas-microsoft-com:vml" xmlns:wp14="http://schemas.microsoft.com/office/word/2010/wordprocessingDrawing" xmlns:wp="http://schemas.openxmlformats.org/drawingml/2006/wordprocessingDrawing" xmlns:w10="urn:schemas-microsoft-com:office:word" xmlns:w="http://schemas.openxmlformats.org/wordprocessingml/2006/main" xmlns:w14="http://schemas.microsoft.com/office/word/2010/wordml" xmlns:w15="http://schemas.microsoft.com/office/word/2012/wordml" xmlns:w16cei="http://schemas.microsoft.com/office/word/2026/wordml/cei" xmlns:w16cex="http://schemas.microsoft.com/office/word/2018/wordml/cex" xmlns:w16cid="http://schemas.microsoft.com/office/word/2016/wordml/cid" xmlns:w16="http://schemas.microsoft.com/office/word/2018/wordml" xmlns:w16du="http://schemas.microsoft.com/office/word/2023/wordml/word16du" xmlns:w16sdtdh="http://schemas.microsoft.com/office/word/2020/wordml/sdtdatahash" xmlns:w16sdtfl="http://schemas.microsoft.com/office/word/2024/wordml/sdtformatlock" xmlns:w16se="http://schemas.microsoft.com/office/word/2015/wordml/symex" xmlns:wpg="http://schemas.microsoft.com/office/word/2010/wordprocessingGroup" xmlns:wpi="http://schemas.microsoft.com/office/word/2010/wordprocessingInk" xmlns:wne="http://schemas.microsoft.com/office/word/2006/wordml" xmlns:wps="http://schemas.microsoft.com/office/word/2010/wordprocessingShape" mc:Ignorable="w14 w15 w16se w16cid w16 w16cex w16sdtdh w16sdtfl w16du wp14">
+<w:document xmlns:wpc="http://schemas.microsoft.com/office/word/2010/wordprocessingCanvas" xmlns:cx="http://schemas.microsoft.com/office/drawing/2014/chartex" xmlns:cx1="http://schemas.microsoft.com/office/drawing/2015/9/8/chartex" xmlns:cx2="http://schemas.microsoft.com/office/drawing/2015/10/21/chartex" xmlns:cx3="http://schemas.microsoft.com/office/drawing/2016/5/9/chartex" xmlns:cx4="http://schemas.microsoft.com/office/drawing/2016/5/10/chartex" xmlns:cx5="http://schemas.microsoft.com/office/drawing/2016/5/11/chartex" xmlns:cx6="http://schemas.microsoft.com/office/drawing/2016/5/12/chartex" xmlns:cx7="http://schemas.microsoft.com/office/drawing/2016/5/13/chartex" xmlns:cx8="http://schemas.microsoft.com/office/drawing/2016/5/14/chartex" xmlns:mc="http://schemas.openxmlformats.org/markup-compatibility/2006" xmlns:aink="http://schemas.microsoft.com/office/drawing/2016/ink" xmlns:am3d="http://schemas.microsoft.com/office/drawing/2017/model3d" xmlns:o="urn:schemas-microsoft-com:office:office" xmlns:oel="http://schemas.microsoft.com/office/2019/extlst" xmlns:r="http://schemas.openxmlformats.org/officeDocument/2006/relationships" xmlns:m="http://schemas.openxmlformats.org/officeDocument/2006/math" xmlns:v="urn:schemas-microsoft-com:vml" xmlns:wp14="http://schemas.microsoft.com/office/word/2010/wordprocessingDrawing" xmlns:wp="http://schemas.openxmlformats.org/drawingml/2006/wordprocessingDrawing" xmlns:w10="urn:schemas-microsoft-com:office:word" xmlns:w="http://schemas.openxmlformats.org/wordprocessingml/2006/main" xmlns:w14="http://schemas.microsoft.com/office/word/2010/wordml" xmlns:w15="http://schemas.microsoft.com/office/word/2012/wordml" xmlns:w16cex="http://schemas.microsoft.com/office/word/2018/wordml/cex" xmlns:w16cid="http://schemas.microsoft.com/office/word/2016/wordml/cid" xmlns:w16="http://schemas.microsoft.com/office/word/2018/wordml" xmlns:w16du="http://schemas.microsoft.com/office/word/2023/wordml/word16du" xmlns:w16sdtdh="http://schemas.microsoft.com/office/word/2020/wordml/sdtdatahash" xmlns:w16sdtfl="http://schemas.microsoft.com/office/word/2024/wordml/sdtformatlock" xmlns:w16se="http://schemas.microsoft.com/office/word/2015/wordml/symex" xmlns:wpg="http://schemas.microsoft.com/office/word/2010/wordprocessingGroup" xmlns:wpi="http://schemas.microsoft.com/office/word/2010/wordprocessingInk" xmlns:wne="http://schemas.microsoft.com/office/word/2006/wordml" xmlns:wps="http://schemas.microsoft.com/office/word/2010/wordprocessingShape" mc:Ignorable="w14 w15 w16se w16cid w16 w16cex w16sdtdh w16sdtfl w16du wp14">
   <w:body>
     <w:p>
       <w:pPr>
@@ -8,16 +8,7 @@
         <w:jc w:val="center"/>
       </w:pPr>
       <w:r>
-        <w:t xml:space="preserve">Stage </w:t>
-      </w:r>
-      <w:r>
-        <w:t>1</w:t>
-      </w:r>
-      <w:r>
-        <w:t xml:space="preserve"> Lab</w:t>
-      </w:r>
-      <w:r>
-        <w:t xml:space="preserve"> - Human vs AI: Building Your First SmartCare Prototype</w:t>
+        <w:t>Stage 1 Lab - Human vs AI: Building Your First SmartCare Prototype</w:t>
       </w:r>
     </w:p>
     <w:p>
@@ -88,6 +79,9 @@
       </w:pPr>
       <w:r>
         <w:t>Document a short AI-use reflection.</w:t>
+      </w:r>
+      <w:r>
+        <w:t xml:space="preserve"> </w:t>
       </w:r>
     </w:p>
     <w:p>
@@ -103,10 +97,7 @@
     </w:p>
     <w:p>
       <w:r>
-        <w:t>stage</w:t>
-      </w:r>
-      <w:r>
-        <w:t>01/</w:t>
+        <w:t>stage01/</w:t>
       </w:r>
       <w:r>
         <w:br/>
@@ -1320,7 +1311,6 @@
     </w:p>
     <w:p>
       <w:r>
-        <w:lastRenderedPageBreak/>
         <w:t>How did you verify the AI output?</w:t>
       </w:r>
     </w:p>
@@ -1399,7 +1389,7 @@
 </file>
 
 <file path=word/numbering.xml><?xml version="1.0" encoding="utf-8"?>
-<w:numbering xmlns:wpc="http://schemas.microsoft.com/office/word/2010/wordprocessingCanvas" xmlns:cx="http://schemas.microsoft.com/office/drawing/2014/chartex" xmlns:cx1="http://schemas.microsoft.com/office/drawing/2015/9/8/chartex" xmlns:cx2="http://schemas.microsoft.com/office/drawing/2015/10/21/chartex" xmlns:cx3="http://schemas.microsoft.com/office/drawing/2016/5/9/chartex" xmlns:cx4="http://schemas.microsoft.com/office/drawing/2016/5/10/chartex" xmlns:cx5="http://schemas.microsoft.com/office/drawing/2016/5/11/chartex" xmlns:cx6="http://schemas.microsoft.com/office/drawing/2016/5/12/chartex" xmlns:cx7="http://schemas.microsoft.com/office/drawing/2016/5/13/chartex" xmlns:cx8="http://schemas.microsoft.com/office/drawing/2016/5/14/chartex" xmlns:mc="http://schemas.openxmlformats.org/markup-compatibility/2006" xmlns:aink="http://schemas.microsoft.com/office/drawing/2016/ink" xmlns:am3d="http://schemas.microsoft.com/office/drawing/2017/model3d" xmlns:o="urn:schemas-microsoft-com:office:office" xmlns:oel="http://schemas.microsoft.com/office/2019/extlst" xmlns:r="http://schemas.openxmlformats.org/officeDocument/2006/relationships" xmlns:m="http://schemas.openxmlformats.org/officeDocument/2006/math" xmlns:v="urn:schemas-microsoft-com:vml" xmlns:wp14="http://schemas.microsoft.com/office/word/2010/wordprocessingDrawing" xmlns:wp="http://schemas.openxmlformats.org/drawingml/2006/wordprocessingDrawing" xmlns:w10="urn:schemas-microsoft-com:office:word" xmlns:w="http://schemas.openxmlformats.org/wordprocessingml/2006/main" xmlns:w14="http://schemas.microsoft.com/office/word/2010/wordml" xmlns:w15="http://schemas.microsoft.com/office/word/2012/wordml" xmlns:w16cei="http://schemas.microsoft.com/office/word/2026/wordml/cei" xmlns:w16cex="http://schemas.microsoft.com/office/word/2018/wordml/cex" xmlns:w16cid="http://schemas.microsoft.com/office/word/2016/wordml/cid" xmlns:w16="http://schemas.microsoft.com/office/word/2018/wordml" xmlns:w16du="http://schemas.microsoft.com/office/word/2023/wordml/word16du" xmlns:w16sdtdh="http://schemas.microsoft.com/office/word/2020/wordml/sdtdatahash" xmlns:w16sdtfl="http://schemas.microsoft.com/office/word/2024/wordml/sdtformatlock" xmlns:w16se="http://schemas.microsoft.com/office/word/2015/wordml/symex" xmlns:wpg="http://schemas.microsoft.com/office/word/2010/wordprocessingGroup" xmlns:wpi="http://schemas.microsoft.com/office/word/2010/wordprocessingInk" xmlns:wne="http://schemas.microsoft.com/office/word/2006/wordml" xmlns:wps="http://schemas.microsoft.com/office/word/2010/wordprocessingShape" mc:Ignorable="w14 w15 w16se w16cid w16 w16cex w16sdtdh w16sdtfl w16du wp14">
+<w:numbering xmlns:wpc="http://schemas.microsoft.com/office/word/2010/wordprocessingCanvas" xmlns:cx="http://schemas.microsoft.com/office/drawing/2014/chartex" xmlns:cx1="http://schemas.microsoft.com/office/drawing/2015/9/8/chartex" xmlns:cx2="http://schemas.microsoft.com/office/drawing/2015/10/21/chartex" xmlns:cx3="http://schemas.microsoft.com/office/drawing/2016/5/9/chartex" xmlns:cx4="http://schemas.microsoft.com/office/drawing/2016/5/10/chartex" xmlns:cx5="http://schemas.microsoft.com/office/drawing/2016/5/11/chartex" xmlns:cx6="http://schemas.microsoft.com/office/drawing/2016/5/12/chartex" xmlns:cx7="http://schemas.microsoft.com/office/drawing/2016/5/13/chartex" xmlns:cx8="http://schemas.microsoft.com/office/drawing/2016/5/14/chartex" xmlns:mc="http://schemas.openxmlformats.org/markup-compatibility/2006" xmlns:aink="http://schemas.microsoft.com/office/drawing/2016/ink" xmlns:am3d="http://schemas.microsoft.com/office/drawing/2017/model3d" xmlns:o="urn:schemas-microsoft-com:office:office" xmlns:oel="http://schemas.microsoft.com/office/2019/extlst" xmlns:r="http://schemas.openxmlformats.org/officeDocument/2006/relationships" xmlns:m="http://schemas.openxmlformats.org/officeDocument/2006/math" xmlns:v="urn:schemas-microsoft-com:vml" xmlns:wp14="http://schemas.microsoft.com/office/word/2010/wordprocessingDrawing" xmlns:wp="http://schemas.openxmlformats.org/drawingml/2006/wordprocessingDrawing" xmlns:w10="urn:schemas-microsoft-com:office:word" xmlns:w="http://schemas.openxmlformats.org/wordprocessingml/2006/main" xmlns:w14="http://schemas.microsoft.com/office/word/2010/wordml" xmlns:w15="http://schemas.microsoft.com/office/word/2012/wordml" xmlns:w16cex="http://schemas.microsoft.com/office/word/2018/wordml/cex" xmlns:w16cid="http://schemas.microsoft.com/office/word/2016/wordml/cid" xmlns:w16="http://schemas.microsoft.com/office/word/2018/wordml" xmlns:w16du="http://schemas.microsoft.com/office/word/2023/wordml/word16du" xmlns:w16sdtdh="http://schemas.microsoft.com/office/word/2020/wordml/sdtdatahash" xmlns:w16sdtfl="http://schemas.microsoft.com/office/word/2024/wordml/sdtformatlock" xmlns:w16se="http://schemas.microsoft.com/office/word/2015/wordml/symex" xmlns:wpg="http://schemas.microsoft.com/office/word/2010/wordprocessingGroup" xmlns:wpi="http://schemas.microsoft.com/office/word/2010/wordprocessingInk" xmlns:wne="http://schemas.microsoft.com/office/word/2006/wordml" xmlns:wps="http://schemas.microsoft.com/office/word/2010/wordprocessingShape" mc:Ignorable="w14 w15 w16se w16cid w16 w16cex w16sdtdh w16sdtfl w16du wp14">
   <w:abstractNum w:abstractNumId="0" w15:restartNumberingAfterBreak="0">
     <w:nsid w:val="FFFFFF7C"/>
     <w:multiLevelType w:val="singleLevel"/>

</xml_diff>

<commit_message>
changes to Stage1 lab handout
</commit_message>
<xml_diff>
--- a/week4/Stage_1_Lab_Student_Handout.docx
+++ b/week4/Stage_1_Lab_Student_Handout.docx
@@ -135,25 +135,110 @@
       </w:r>
     </w:p>
     <w:p>
+      <w:pPr>
+        <w:pStyle w:val="ListParagraph"/>
+        <w:numPr>
+          <w:ilvl w:val="0"/>
+          <w:numId w:val="10"/>
+        </w:numPr>
+      </w:pPr>
+      <w:r>
+        <w:t>Patient Name</w:t>
+      </w:r>
+    </w:p>
+    <w:p>
+      <w:pPr>
+        <w:pStyle w:val="ListParagraph"/>
+        <w:numPr>
+          <w:ilvl w:val="0"/>
+          <w:numId w:val="10"/>
+        </w:numPr>
+      </w:pPr>
+      <w:r>
+        <w:t>Practitioner Name</w:t>
+      </w:r>
+    </w:p>
+    <w:p>
+      <w:pPr>
+        <w:pStyle w:val="ListParagraph"/>
+        <w:numPr>
+          <w:ilvl w:val="0"/>
+          <w:numId w:val="10"/>
+        </w:numPr>
+      </w:pPr>
+      <w:r>
+        <w:t>Appt time</w:t>
+      </w:r>
+    </w:p>
+    <w:p>
       <w:r>
         <w:t>What functions might be useful?</w:t>
       </w:r>
     </w:p>
     <w:p>
+      <w:pPr>
+        <w:pStyle w:val="ListParagraph"/>
+        <w:numPr>
+          <w:ilvl w:val="0"/>
+          <w:numId w:val="10"/>
+        </w:numPr>
+      </w:pPr>
+      <w:r>
+        <w:t>location/room of appt</w:t>
+      </w:r>
+    </w:p>
+    <w:p>
       <w:r>
         <w:t>What could go wrong?</w:t>
       </w:r>
     </w:p>
     <w:p>
+      <w:pPr>
+        <w:pStyle w:val="ListParagraph"/>
+        <w:numPr>
+          <w:ilvl w:val="0"/>
+          <w:numId w:val="10"/>
+        </w:numPr>
+      </w:pPr>
+      <w:r>
+        <w:t>Schedule conflicts</w:t>
+      </w:r>
+    </w:p>
+    <w:p>
+      <w:pPr>
+        <w:pStyle w:val="ListParagraph"/>
+        <w:numPr>
+          <w:ilvl w:val="0"/>
+          <w:numId w:val="10"/>
+        </w:numPr>
+      </w:pPr>
+      <w:r>
+        <w:t>Invalid data entry</w:t>
+      </w:r>
+    </w:p>
+    <w:p>
       <w:r>
         <w:t>What requirements are unclear?</w:t>
       </w:r>
     </w:p>
     <w:p>
       <w:pPr>
+        <w:pStyle w:val="ListParagraph"/>
+        <w:numPr>
+          <w:ilvl w:val="0"/>
+          <w:numId w:val="10"/>
+        </w:numPr>
+      </w:pPr>
+      <w:r>
+        <w:t>How data should be stored &amp; accessed</w:t>
+      </w:r>
+    </w:p>
+    <w:p>
+      <w:pPr>
         <w:pStyle w:val="Heading1"/>
       </w:pPr>
       <w:r>
+        <w:lastRenderedPageBreak/>
         <w:t>Part B - Build a Human-Written Prototype: AI OFF</w:t>
       </w:r>
     </w:p>
@@ -331,7 +416,6 @@
           <w:b/>
           <w:bCs/>
         </w:rPr>
-        <w:lastRenderedPageBreak/>
         <w:t>print(f"Patient: {patient1_name} | Practitioner: {practitioner1_name} | Time: {appointment1_time}")</w:t>
       </w:r>
     </w:p>
@@ -924,6 +1008,7 @@
           <w:bCs/>
           <w:lang w:val="en-AU"/>
         </w:rPr>
+        <w:lastRenderedPageBreak/>
         <w:t>display_appointments()</w:t>
       </w:r>
     </w:p>
@@ -947,13 +1032,71 @@
           <w:color w:val="C00000"/>
         </w:rPr>
       </w:pPr>
+      <w:r>
+        <w:rPr>
+          <w:color w:val="C00000"/>
+        </w:rPr>
+        <w:t>First program cannot make new appointments, and is limited to 2 slots. Using numbered variables is finite and in this case wont allow more than 2.</w:t>
+      </w:r>
+    </w:p>
+    <w:p>
+      <w:pPr>
+        <w:rPr>
+          <w:color w:val="C00000"/>
+        </w:rPr>
+      </w:pPr>
+      <w:r>
+        <w:rPr>
+          <w:color w:val="C00000"/>
+        </w:rPr>
+        <w:t>Appointments are only stored temporarily. When the program closes all data is lost</w:t>
+      </w:r>
+    </w:p>
+    <w:p>
+      <w:pPr>
+        <w:rPr>
+          <w:color w:val="C00000"/>
+        </w:rPr>
+      </w:pPr>
+      <w:r>
+        <w:rPr>
+          <w:color w:val="C00000"/>
+        </w:rPr>
+        <w:t>Would be cool if we could check for conficts</w:t>
+      </w:r>
+    </w:p>
+    <w:p>
+      <w:pPr>
+        <w:rPr>
+          <w:color w:val="C00000"/>
+        </w:rPr>
+      </w:pPr>
+      <w:r>
+        <w:rPr>
+          <w:color w:val="C00000"/>
+        </w:rPr>
+        <w:t>Inputs are not validated, program shouldn’t throw errors but might record rubbish data.</w:t>
+      </w:r>
+    </w:p>
+    <w:p>
+      <w:pPr>
+        <w:rPr>
+          <w:color w:val="C00000"/>
+        </w:rPr>
+      </w:pPr>
+    </w:p>
+    <w:p>
+      <w:pPr>
+        <w:rPr>
+          <w:color w:val="C00000"/>
+        </w:rPr>
+      </w:pPr>
     </w:p>
     <w:p>
       <w:pPr>
         <w:pStyle w:val="Heading1"/>
       </w:pPr>
       <w:r>
-        <w:lastRenderedPageBreak/>
         <w:t>Part C - Use AI as Tutor: AI ON</w:t>
       </w:r>
       <w:r>
@@ -1026,9 +1169,1573 @@
     </w:p>
     <w:p>
       <w:pPr>
+        <w:rPr>
+          <w:lang w:val="en-AU"/>
+        </w:rPr>
+      </w:pPr>
+      <w:r>
+        <w:rPr>
+          <w:lang w:val="en-AU"/>
+        </w:rPr>
+        <w:t xml:space="preserve">I'll explain the program at an introductory Python level, point out some limitations, and suggest practical improvements without rewriting the whole application. The analysis is based on </w:t>
+      </w:r>
+      <w:hyperlink r:id="rId6" w:history="1">
+        <w:r>
+          <w:rPr>
+            <w:rStyle w:val="Hyperlink"/>
+            <w:lang w:val="en-AU"/>
+          </w:rPr>
+          <w:t>smartcare_v01.py</w:t>
+        </w:r>
+      </w:hyperlink>
+      <w:r>
+        <w:rPr>
+          <w:lang w:val="en-AU"/>
+        </w:rPr>
+        <w:t xml:space="preserve">. </w:t>
+      </w:r>
+      <w:hyperlink r:id="rId7" w:history="1">
+        <w:r>
+          <w:rPr>
+            <w:rStyle w:val="Hyperlink"/>
+            <w:lang w:val="en-AU"/>
+          </w:rPr>
+          <w:t>[unicanberr...epoint.com]</w:t>
+        </w:r>
+      </w:hyperlink>
+    </w:p>
+    <w:p>
+      <w:pPr>
+        <w:rPr>
+          <w:b/>
+          <w:bCs/>
+          <w:lang w:val="en-AU"/>
+        </w:rPr>
+      </w:pPr>
+      <w:r>
+        <w:rPr>
+          <w:b/>
+          <w:bCs/>
+          <w:lang w:val="en-AU"/>
+        </w:rPr>
+        <w:t>1. What the code does</w:t>
+      </w:r>
+    </w:p>
+    <w:p>
+      <w:pPr>
+        <w:rPr>
+          <w:lang w:val="en-AU"/>
+        </w:rPr>
+      </w:pPr>
+      <w:r>
+        <w:rPr>
+          <w:lang w:val="en-AU"/>
+        </w:rPr>
+        <w:t>This program is a simple command-line appointment booking system.</w:t>
+      </w:r>
+    </w:p>
+    <w:p>
+      <w:pPr>
+        <w:rPr>
+          <w:b/>
+          <w:bCs/>
+          <w:lang w:val="en-AU"/>
+        </w:rPr>
+      </w:pPr>
+      <w:r>
+        <w:rPr>
+          <w:b/>
+          <w:bCs/>
+          <w:lang w:val="en-AU"/>
+        </w:rPr>
+        <w:t>Step-by-step</w:t>
+      </w:r>
+    </w:p>
+    <w:p>
+      <w:pPr>
+        <w:numPr>
+          <w:ilvl w:val="0"/>
+          <w:numId w:val="11"/>
+        </w:numPr>
+        <w:rPr>
+          <w:lang w:val="en-AU"/>
+        </w:rPr>
+      </w:pPr>
+      <w:r>
+        <w:rPr>
+          <w:b/>
+          <w:bCs/>
+          <w:lang w:val="en-AU"/>
+        </w:rPr>
+        <w:t>Creates an empty list</w:t>
+      </w:r>
+      <w:r>
+        <w:rPr>
+          <w:lang w:val="en-AU"/>
+        </w:rPr>
+        <w:t xml:space="preserve"> </w:t>
+      </w:r>
+    </w:p>
+    <w:p>
+      <w:pPr>
+        <w:rPr>
+          <w:lang w:val="en-AU"/>
+        </w:rPr>
+      </w:pPr>
+      <w:r>
+        <w:rPr>
+          <w:lang w:val="en-AU"/>
+        </w:rPr>
+        <w:t>appointments = []</w:t>
+      </w:r>
+    </w:p>
+    <w:p>
+      <w:pPr>
+        <w:rPr>
+          <w:lang w:val="en-AU"/>
+        </w:rPr>
+      </w:pPr>
+      <w:r>
+        <w:rPr>
+          <w:lang w:val="en-AU"/>
+        </w:rPr>
+        <w:t xml:space="preserve">This list stores all appointment records while the program is running. </w:t>
+      </w:r>
+      <w:hyperlink r:id="rId8" w:history="1">
+        <w:r>
+          <w:rPr>
+            <w:rStyle w:val="Hyperlink"/>
+            <w:lang w:val="en-AU"/>
+          </w:rPr>
+          <w:t>[unicanberr...epoint.com]</w:t>
+        </w:r>
+      </w:hyperlink>
+    </w:p>
+    <w:p>
+      <w:pPr>
+        <w:numPr>
+          <w:ilvl w:val="0"/>
+          <w:numId w:val="11"/>
+        </w:numPr>
+        <w:rPr>
+          <w:lang w:val="en-AU"/>
+        </w:rPr>
+      </w:pPr>
+      <w:r>
+        <w:rPr>
+          <w:b/>
+          <w:bCs/>
+          <w:lang w:val="en-AU"/>
+        </w:rPr>
+        <w:t>Defines a booking function</w:t>
+      </w:r>
+      <w:r>
+        <w:rPr>
+          <w:lang w:val="en-AU"/>
+        </w:rPr>
+        <w:t xml:space="preserve"> </w:t>
+      </w:r>
+    </w:p>
+    <w:p>
+      <w:pPr>
+        <w:rPr>
+          <w:lang w:val="en-AU"/>
+        </w:rPr>
+      </w:pPr>
+      <w:r>
+        <w:rPr>
+          <w:lang w:val="en-AU"/>
+        </w:rPr>
+        <w:t>def book_appointment(patient_name, practitioner_name, appointment_time):</w:t>
+      </w:r>
+    </w:p>
+    <w:p>
+      <w:pPr>
+        <w:numPr>
+          <w:ilvl w:val="1"/>
+          <w:numId w:val="11"/>
+        </w:numPr>
+        <w:rPr>
+          <w:lang w:val="en-AU"/>
+        </w:rPr>
+      </w:pPr>
+      <w:r>
+        <w:rPr>
+          <w:lang w:val="en-AU"/>
+        </w:rPr>
+        <w:t>Checks that the patient name is not empty.</w:t>
+      </w:r>
+    </w:p>
+    <w:p>
+      <w:pPr>
+        <w:numPr>
+          <w:ilvl w:val="1"/>
+          <w:numId w:val="11"/>
+        </w:numPr>
+        <w:rPr>
+          <w:lang w:val="en-AU"/>
+        </w:rPr>
+      </w:pPr>
+      <w:r>
+        <w:rPr>
+          <w:lang w:val="en-AU"/>
+        </w:rPr>
+        <w:lastRenderedPageBreak/>
+        <w:t xml:space="preserve">Creates a dictionary containing: </w:t>
+      </w:r>
+    </w:p>
+    <w:p>
+      <w:pPr>
+        <w:numPr>
+          <w:ilvl w:val="2"/>
+          <w:numId w:val="11"/>
+        </w:numPr>
+        <w:rPr>
+          <w:lang w:val="en-AU"/>
+        </w:rPr>
+      </w:pPr>
+      <w:r>
+        <w:rPr>
+          <w:lang w:val="en-AU"/>
+        </w:rPr>
+        <w:t>patient</w:t>
+      </w:r>
+    </w:p>
+    <w:p>
+      <w:pPr>
+        <w:numPr>
+          <w:ilvl w:val="2"/>
+          <w:numId w:val="11"/>
+        </w:numPr>
+        <w:rPr>
+          <w:lang w:val="en-AU"/>
+        </w:rPr>
+      </w:pPr>
+      <w:r>
+        <w:rPr>
+          <w:lang w:val="en-AU"/>
+        </w:rPr>
+        <w:t>practitioner</w:t>
+      </w:r>
+    </w:p>
+    <w:p>
+      <w:pPr>
+        <w:numPr>
+          <w:ilvl w:val="2"/>
+          <w:numId w:val="11"/>
+        </w:numPr>
+        <w:rPr>
+          <w:lang w:val="en-AU"/>
+        </w:rPr>
+      </w:pPr>
+      <w:r>
+        <w:rPr>
+          <w:lang w:val="en-AU"/>
+        </w:rPr>
+        <w:t>appointment time</w:t>
+      </w:r>
+    </w:p>
+    <w:p>
+      <w:pPr>
+        <w:numPr>
+          <w:ilvl w:val="1"/>
+          <w:numId w:val="11"/>
+        </w:numPr>
+        <w:rPr>
+          <w:lang w:val="en-AU"/>
+        </w:rPr>
+      </w:pPr>
+      <w:r>
+        <w:rPr>
+          <w:lang w:val="en-AU"/>
+        </w:rPr>
+        <w:t xml:space="preserve">Adds the dictionary to the appointments list. </w:t>
+      </w:r>
+      <w:hyperlink r:id="rId9" w:history="1">
+        <w:r>
+          <w:rPr>
+            <w:rStyle w:val="Hyperlink"/>
+            <w:lang w:val="en-AU"/>
+          </w:rPr>
+          <w:t>[unicanberr...epoint.com]</w:t>
+        </w:r>
+      </w:hyperlink>
+    </w:p>
+    <w:p>
+      <w:pPr>
+        <w:numPr>
+          <w:ilvl w:val="0"/>
+          <w:numId w:val="11"/>
+        </w:numPr>
+        <w:rPr>
+          <w:lang w:val="en-AU"/>
+        </w:rPr>
+      </w:pPr>
+      <w:r>
+        <w:rPr>
+          <w:b/>
+          <w:bCs/>
+          <w:lang w:val="en-AU"/>
+        </w:rPr>
+        <w:t>Defines a display function</w:t>
+      </w:r>
+      <w:r>
+        <w:rPr>
+          <w:lang w:val="en-AU"/>
+        </w:rPr>
+        <w:t xml:space="preserve"> </w:t>
+      </w:r>
+    </w:p>
+    <w:p>
+      <w:pPr>
+        <w:rPr>
+          <w:lang w:val="en-AU"/>
+        </w:rPr>
+      </w:pPr>
+      <w:r>
+        <w:rPr>
+          <w:lang w:val="en-AU"/>
+        </w:rPr>
+        <w:t>def display_appointments():</w:t>
+      </w:r>
+    </w:p>
+    <w:p>
+      <w:pPr>
+        <w:numPr>
+          <w:ilvl w:val="1"/>
+          <w:numId w:val="11"/>
+        </w:numPr>
+        <w:rPr>
+          <w:lang w:val="en-AU"/>
+        </w:rPr>
+      </w:pPr>
+      <w:r>
+        <w:rPr>
+          <w:lang w:val="en-AU"/>
+        </w:rPr>
+        <w:t xml:space="preserve">If there are no appointments, it prints: </w:t>
+      </w:r>
+    </w:p>
+    <w:p>
+      <w:pPr>
+        <w:numPr>
+          <w:ilvl w:val="1"/>
+          <w:numId w:val="11"/>
+        </w:numPr>
+        <w:rPr>
+          <w:lang w:val="en-AU"/>
+        </w:rPr>
+      </w:pPr>
+      <w:r>
+        <w:rPr>
+          <w:lang w:val="en-AU"/>
+        </w:rPr>
+        <w:t>No appointments recorded.</w:t>
+      </w:r>
+    </w:p>
+    <w:p>
+      <w:pPr>
+        <w:numPr>
+          <w:ilvl w:val="1"/>
+          <w:numId w:val="11"/>
+        </w:numPr>
+        <w:rPr>
+          <w:lang w:val="en-AU"/>
+        </w:rPr>
+      </w:pPr>
+      <w:r>
+        <w:rPr>
+          <w:lang w:val="en-AU"/>
+        </w:rPr>
+        <w:t xml:space="preserve">Otherwise, it loops through the list and displays each appointment. </w:t>
+      </w:r>
+      <w:hyperlink r:id="rId10" w:history="1">
+        <w:r>
+          <w:rPr>
+            <w:rStyle w:val="Hyperlink"/>
+            <w:lang w:val="en-AU"/>
+          </w:rPr>
+          <w:t>[unicanberr...epoint.com]</w:t>
+        </w:r>
+      </w:hyperlink>
+    </w:p>
+    <w:p>
+      <w:pPr>
+        <w:numPr>
+          <w:ilvl w:val="0"/>
+          <w:numId w:val="11"/>
+        </w:numPr>
+        <w:rPr>
+          <w:lang w:val="en-AU"/>
+        </w:rPr>
+      </w:pPr>
+      <w:r>
+        <w:rPr>
+          <w:b/>
+          <w:bCs/>
+          <w:lang w:val="en-AU"/>
+        </w:rPr>
+        <w:t>Displays a welcome message</w:t>
+      </w:r>
+      <w:r>
+        <w:rPr>
+          <w:lang w:val="en-AU"/>
+        </w:rPr>
+        <w:t xml:space="preserve"> </w:t>
+      </w:r>
+    </w:p>
+    <w:p>
+      <w:pPr>
+        <w:rPr>
+          <w:lang w:val="en-AU"/>
+        </w:rPr>
+      </w:pPr>
+      <w:r>
+        <w:rPr>
+          <w:lang w:val="en-AU"/>
+        </w:rPr>
+        <w:t>print("Welcome to SmartCare: The Clinical Appointment Booking System!")</w:t>
+      </w:r>
+    </w:p>
+    <w:p>
+      <w:pPr>
+        <w:rPr>
+          <w:lang w:val="en-AU"/>
+        </w:rPr>
+      </w:pPr>
+      <w:hyperlink r:id="rId11" w:history="1">
+        <w:r>
+          <w:rPr>
+            <w:rStyle w:val="Hyperlink"/>
+            <w:lang w:val="en-AU"/>
+          </w:rPr>
+          <w:t>[unicanberr...epoint.com]</w:t>
+        </w:r>
+      </w:hyperlink>
+    </w:p>
+    <w:p>
+      <w:pPr>
+        <w:numPr>
+          <w:ilvl w:val="0"/>
+          <w:numId w:val="11"/>
+        </w:numPr>
+        <w:rPr>
+          <w:lang w:val="en-AU"/>
+        </w:rPr>
+      </w:pPr>
+      <w:r>
+        <w:rPr>
+          <w:b/>
+          <w:bCs/>
+          <w:lang w:val="en-AU"/>
+        </w:rPr>
+        <w:t>Runs a menu in a loop</w:t>
+      </w:r>
+      <w:r>
+        <w:rPr>
+          <w:lang w:val="en-AU"/>
+        </w:rPr>
+        <w:t xml:space="preserve"> </w:t>
+      </w:r>
+    </w:p>
+    <w:p>
+      <w:pPr>
+        <w:rPr>
+          <w:lang w:val="en-AU"/>
+        </w:rPr>
+      </w:pPr>
+      <w:r>
+        <w:rPr>
+          <w:lang w:val="en-AU"/>
+        </w:rPr>
+        <w:t>while True:</w:t>
+      </w:r>
+    </w:p>
+    <w:p>
+      <w:pPr>
+        <w:rPr>
+          <w:lang w:val="en-AU"/>
+        </w:rPr>
+      </w:pPr>
+      <w:r>
+        <w:rPr>
+          <w:lang w:val="en-AU"/>
+        </w:rPr>
+        <w:t>The user can:</w:t>
+      </w:r>
+    </w:p>
+    <w:p>
+      <w:pPr>
+        <w:numPr>
+          <w:ilvl w:val="1"/>
+          <w:numId w:val="11"/>
+        </w:numPr>
+        <w:rPr>
+          <w:lang w:val="en-AU"/>
+        </w:rPr>
+      </w:pPr>
+      <w:r>
+        <w:rPr>
+          <w:lang w:val="en-AU"/>
+        </w:rPr>
+        <w:t>Create an appointment</w:t>
+      </w:r>
+    </w:p>
+    <w:p>
+      <w:pPr>
+        <w:numPr>
+          <w:ilvl w:val="1"/>
+          <w:numId w:val="11"/>
+        </w:numPr>
+        <w:rPr>
+          <w:lang w:val="en-AU"/>
+        </w:rPr>
+      </w:pPr>
+      <w:r>
+        <w:rPr>
+          <w:lang w:val="en-AU"/>
+        </w:rPr>
+        <w:t>View bookings</w:t>
+      </w:r>
+    </w:p>
+    <w:p>
+      <w:pPr>
+        <w:numPr>
+          <w:ilvl w:val="1"/>
+          <w:numId w:val="11"/>
+        </w:numPr>
+        <w:rPr>
+          <w:lang w:val="en-AU"/>
+        </w:rPr>
+      </w:pPr>
+      <w:r>
+        <w:rPr>
+          <w:lang w:val="en-AU"/>
+        </w:rPr>
+        <w:t xml:space="preserve">Exit the program </w:t>
+      </w:r>
+      <w:hyperlink r:id="rId12" w:history="1">
+        <w:r>
+          <w:rPr>
+            <w:rStyle w:val="Hyperlink"/>
+            <w:lang w:val="en-AU"/>
+          </w:rPr>
+          <w:t>[unicanberr...epoint.com]</w:t>
+        </w:r>
+      </w:hyperlink>
+    </w:p>
+    <w:p>
+      <w:pPr>
+        <w:numPr>
+          <w:ilvl w:val="0"/>
+          <w:numId w:val="11"/>
+        </w:numPr>
+        <w:rPr>
+          <w:lang w:val="en-AU"/>
+        </w:rPr>
+      </w:pPr>
+      <w:r>
+        <w:rPr>
+          <w:b/>
+          <w:bCs/>
+          <w:lang w:val="en-AU"/>
+        </w:rPr>
+        <w:t>Processes user input</w:t>
+      </w:r>
+    </w:p>
+    <w:p>
+      <w:pPr>
+        <w:numPr>
+          <w:ilvl w:val="1"/>
+          <w:numId w:val="11"/>
+        </w:numPr>
+        <w:rPr>
+          <w:lang w:val="en-AU"/>
+        </w:rPr>
+      </w:pPr>
+      <w:r>
+        <w:rPr>
+          <w:lang w:val="en-AU"/>
+        </w:rPr>
+        <w:t>"1" calls book_appointment()</w:t>
+      </w:r>
+    </w:p>
+    <w:p>
+      <w:pPr>
+        <w:numPr>
+          <w:ilvl w:val="1"/>
+          <w:numId w:val="11"/>
+        </w:numPr>
+        <w:rPr>
+          <w:lang w:val="en-AU"/>
+        </w:rPr>
+      </w:pPr>
+      <w:r>
+        <w:rPr>
+          <w:lang w:val="en-AU"/>
+        </w:rPr>
+        <w:t>"2" calls display_appointments()</w:t>
+      </w:r>
+    </w:p>
+    <w:p>
+      <w:pPr>
+        <w:numPr>
+          <w:ilvl w:val="1"/>
+          <w:numId w:val="11"/>
+        </w:numPr>
+        <w:rPr>
+          <w:lang w:val="en-AU"/>
+        </w:rPr>
+      </w:pPr>
+      <w:r>
+        <w:rPr>
+          <w:lang w:val="en-AU"/>
+        </w:rPr>
+        <w:t>"3" exits the loop using break</w:t>
+      </w:r>
+    </w:p>
+    <w:p>
+      <w:pPr>
+        <w:numPr>
+          <w:ilvl w:val="1"/>
+          <w:numId w:val="11"/>
+        </w:numPr>
+        <w:rPr>
+          <w:lang w:val="en-AU"/>
+        </w:rPr>
+      </w:pPr>
+      <w:r>
+        <w:rPr>
+          <w:lang w:val="en-AU"/>
+        </w:rPr>
+        <w:t xml:space="preserve">Any other input shows an error message. </w:t>
+      </w:r>
+      <w:hyperlink r:id="rId13" w:history="1">
+        <w:r>
+          <w:rPr>
+            <w:rStyle w:val="Hyperlink"/>
+            <w:lang w:val="en-AU"/>
+          </w:rPr>
+          <w:t>[unicanberr...epoint.com]</w:t>
+        </w:r>
+      </w:hyperlink>
+    </w:p>
+    <w:p>
+      <w:pPr>
+        <w:rPr>
+          <w:lang w:val="en-AU"/>
+        </w:rPr>
+      </w:pPr>
+      <w:r>
+        <w:rPr>
+          <w:lang w:val="en-AU"/>
+        </w:rPr>
+        <w:pict w14:anchorId="5790F858">
+          <v:rect id="_x0000_i1043" style="width:0;height:1.5pt" o:hralign="center" o:hrstd="t" o:hr="t" fillcolor="#a0a0a0" stroked="f"/>
+        </w:pict>
+      </w:r>
+    </w:p>
+    <w:p>
+      <w:pPr>
+        <w:rPr>
+          <w:b/>
+          <w:bCs/>
+          <w:lang w:val="en-AU"/>
+        </w:rPr>
+      </w:pPr>
+      <w:r>
+        <w:rPr>
+          <w:b/>
+          <w:bCs/>
+          <w:lang w:val="en-AU"/>
+        </w:rPr>
+        <w:t>2. Three limitations</w:t>
+      </w:r>
+    </w:p>
+    <w:p>
+      <w:pPr>
+        <w:rPr>
+          <w:b/>
+          <w:bCs/>
+          <w:lang w:val="en-AU"/>
+        </w:rPr>
+      </w:pPr>
+      <w:r>
+        <w:rPr>
+          <w:b/>
+          <w:bCs/>
+          <w:lang w:val="en-AU"/>
+        </w:rPr>
+        <w:t>1. Appointments are not saved permanently</w:t>
+      </w:r>
+    </w:p>
+    <w:p>
+      <w:pPr>
+        <w:rPr>
+          <w:lang w:val="en-AU"/>
+        </w:rPr>
+      </w:pPr>
+      <w:r>
+        <w:rPr>
+          <w:lang w:val="en-AU"/>
+        </w:rPr>
+        <w:t>Appointments exist only in memory:</w:t>
+      </w:r>
+    </w:p>
+    <w:p>
+      <w:pPr>
+        <w:rPr>
+          <w:lang w:val="en-AU"/>
+        </w:rPr>
+      </w:pPr>
+      <w:r>
+        <w:rPr>
+          <w:lang w:val="en-AU"/>
+        </w:rPr>
+        <w:lastRenderedPageBreak/>
+        <w:t>appointments = []</w:t>
+      </w:r>
+    </w:p>
+    <w:p>
+      <w:pPr>
+        <w:rPr>
+          <w:lang w:val="en-AU"/>
+        </w:rPr>
+      </w:pPr>
+      <w:r>
+        <w:rPr>
+          <w:lang w:val="en-AU"/>
+        </w:rPr>
+        <w:t xml:space="preserve">When the program closes, all bookings are lost. The comments suggest that file saving was planned but not implemented. </w:t>
+      </w:r>
+      <w:hyperlink r:id="rId14" w:history="1">
+        <w:r>
+          <w:rPr>
+            <w:rStyle w:val="Hyperlink"/>
+            <w:lang w:val="en-AU"/>
+          </w:rPr>
+          <w:t>[unicanberr...epoint.com]</w:t>
+        </w:r>
+      </w:hyperlink>
+    </w:p>
+    <w:p>
+      <w:pPr>
+        <w:rPr>
+          <w:b/>
+          <w:bCs/>
+          <w:lang w:val="en-AU"/>
+        </w:rPr>
+      </w:pPr>
+      <w:r>
+        <w:rPr>
+          <w:b/>
+          <w:bCs/>
+          <w:lang w:val="en-AU"/>
+        </w:rPr>
+        <w:t>2. Limited input validation</w:t>
+      </w:r>
+    </w:p>
+    <w:p>
+      <w:pPr>
+        <w:rPr>
+          <w:lang w:val="en-AU"/>
+        </w:rPr>
+      </w:pPr>
+      <w:r>
+        <w:rPr>
+          <w:lang w:val="en-AU"/>
+        </w:rPr>
+        <w:t>Only the patient name is checked:</w:t>
+      </w:r>
+    </w:p>
+    <w:p>
+      <w:pPr>
+        <w:rPr>
+          <w:lang w:val="en-AU"/>
+        </w:rPr>
+      </w:pPr>
+      <w:r>
+        <w:rPr>
+          <w:lang w:val="en-AU"/>
+        </w:rPr>
+        <w:t>if not patient_name:</w:t>
+      </w:r>
+    </w:p>
+    <w:p>
+      <w:pPr>
+        <w:rPr>
+          <w:lang w:val="en-AU"/>
+        </w:rPr>
+      </w:pPr>
+      <w:r>
+        <w:rPr>
+          <w:lang w:val="en-AU"/>
+        </w:rPr>
+        <w:t>raise ValueError(...)</w:t>
+      </w:r>
+    </w:p>
+    <w:p>
+      <w:pPr>
+        <w:rPr>
+          <w:lang w:val="en-AU"/>
+        </w:rPr>
+      </w:pPr>
+      <w:r>
+        <w:rPr>
+          <w:lang w:val="en-AU"/>
+        </w:rPr>
+        <w:t>There is no validation for:</w:t>
+      </w:r>
+    </w:p>
+    <w:p>
+      <w:pPr>
+        <w:numPr>
+          <w:ilvl w:val="0"/>
+          <w:numId w:val="12"/>
+        </w:numPr>
+        <w:rPr>
+          <w:lang w:val="en-AU"/>
+        </w:rPr>
+      </w:pPr>
+      <w:r>
+        <w:rPr>
+          <w:lang w:val="en-AU"/>
+        </w:rPr>
+        <w:t>Empty practitioner names</w:t>
+      </w:r>
+    </w:p>
+    <w:p>
+      <w:pPr>
+        <w:numPr>
+          <w:ilvl w:val="0"/>
+          <w:numId w:val="12"/>
+        </w:numPr>
+        <w:rPr>
+          <w:lang w:val="en-AU"/>
+        </w:rPr>
+      </w:pPr>
+      <w:r>
+        <w:rPr>
+          <w:lang w:val="en-AU"/>
+        </w:rPr>
+        <w:t>Invalid appointment times</w:t>
+      </w:r>
+    </w:p>
+    <w:p>
+      <w:pPr>
+        <w:numPr>
+          <w:ilvl w:val="0"/>
+          <w:numId w:val="12"/>
+        </w:numPr>
+        <w:rPr>
+          <w:lang w:val="en-AU"/>
+        </w:rPr>
+      </w:pPr>
+      <w:r>
+        <w:rPr>
+          <w:lang w:val="en-AU"/>
+        </w:rPr>
+        <w:t xml:space="preserve">Incorrect time formats such as "abc" or "99:99" </w:t>
+      </w:r>
+      <w:hyperlink r:id="rId15" w:history="1">
+        <w:r>
+          <w:rPr>
+            <w:rStyle w:val="Hyperlink"/>
+            <w:lang w:val="en-AU"/>
+          </w:rPr>
+          <w:t>[unicanberr...epoint.com]</w:t>
+        </w:r>
+      </w:hyperlink>
+    </w:p>
+    <w:p>
+      <w:pPr>
+        <w:rPr>
+          <w:b/>
+          <w:bCs/>
+          <w:lang w:val="en-AU"/>
+        </w:rPr>
+      </w:pPr>
+      <w:r>
+        <w:rPr>
+          <w:b/>
+          <w:bCs/>
+          <w:lang w:val="en-AU"/>
+        </w:rPr>
+        <w:t>3. No conflict checking</w:t>
+      </w:r>
+    </w:p>
+    <w:p>
+      <w:pPr>
+        <w:rPr>
+          <w:lang w:val="en-AU"/>
+        </w:rPr>
+      </w:pPr>
+      <w:r>
+        <w:rPr>
+          <w:lang w:val="en-AU"/>
+        </w:rPr>
+        <w:t>The program allows multiple appointments at the same time:</w:t>
+      </w:r>
+    </w:p>
+    <w:p>
+      <w:pPr>
+        <w:rPr>
+          <w:lang w:val="en-AU"/>
+        </w:rPr>
+      </w:pPr>
+      <w:r>
+        <w:rPr>
+          <w:lang w:val="en-AU"/>
+        </w:rPr>
+        <w:t>appointments.append(appointment)</w:t>
+      </w:r>
+    </w:p>
+    <w:p>
+      <w:pPr>
+        <w:rPr>
+          <w:lang w:val="en-AU"/>
+        </w:rPr>
+      </w:pPr>
+      <w:r>
+        <w:rPr>
+          <w:lang w:val="en-AU"/>
+        </w:rPr>
+        <w:t xml:space="preserve">There is no check to see whether a practitioner already has an appointment scheduled for that time. </w:t>
+      </w:r>
+      <w:hyperlink r:id="rId16" w:history="1">
+        <w:r>
+          <w:rPr>
+            <w:rStyle w:val="Hyperlink"/>
+            <w:lang w:val="en-AU"/>
+          </w:rPr>
+          <w:t>[unicanberr...epoint.com]</w:t>
+        </w:r>
+      </w:hyperlink>
+    </w:p>
+    <w:p>
+      <w:pPr>
+        <w:rPr>
+          <w:lang w:val="en-AU"/>
+        </w:rPr>
+      </w:pPr>
+      <w:r>
+        <w:rPr>
+          <w:lang w:val="en-AU"/>
+        </w:rPr>
+        <w:pict w14:anchorId="6F942ACC">
+          <v:rect id="_x0000_i1044" style="width:0;height:1.5pt" o:hralign="center" o:hrstd="t" o:hr="t" fillcolor="#a0a0a0" stroked="f"/>
+        </w:pict>
+      </w:r>
+    </w:p>
+    <w:p>
+      <w:pPr>
+        <w:rPr>
+          <w:b/>
+          <w:bCs/>
+          <w:lang w:val="en-AU"/>
+        </w:rPr>
+      </w:pPr>
+      <w:r>
+        <w:rPr>
+          <w:b/>
+          <w:bCs/>
+          <w:lang w:val="en-AU"/>
+        </w:rPr>
+        <w:t>3. Suggested improvements</w:t>
+      </w:r>
+    </w:p>
+    <w:p>
+      <w:pPr>
+        <w:rPr>
+          <w:b/>
+          <w:bCs/>
+          <w:lang w:val="en-AU"/>
+        </w:rPr>
+      </w:pPr>
+      <w:r>
+        <w:rPr>
+          <w:b/>
+          <w:bCs/>
+          <w:lang w:val="en-AU"/>
+        </w:rPr>
+        <w:t>Improvement 1: Validate all inputs</w:t>
+      </w:r>
+    </w:p>
+    <w:p>
+      <w:pPr>
+        <w:rPr>
+          <w:lang w:val="en-AU"/>
+        </w:rPr>
+      </w:pPr>
+      <w:r>
+        <w:rPr>
+          <w:lang w:val="en-AU"/>
+        </w:rPr>
+        <w:t>Before creating an appointment:</w:t>
+      </w:r>
+    </w:p>
+    <w:p>
+      <w:pPr>
+        <w:numPr>
+          <w:ilvl w:val="0"/>
+          <w:numId w:val="13"/>
+        </w:numPr>
+        <w:rPr>
+          <w:lang w:val="en-AU"/>
+        </w:rPr>
+      </w:pPr>
+      <w:r>
+        <w:rPr>
+          <w:lang w:val="en-AU"/>
+        </w:rPr>
+        <w:t>Check that practitioner names are not empty.</w:t>
+      </w:r>
+    </w:p>
+    <w:p>
+      <w:pPr>
+        <w:numPr>
+          <w:ilvl w:val="0"/>
+          <w:numId w:val="13"/>
+        </w:numPr>
+        <w:rPr>
+          <w:lang w:val="en-AU"/>
+        </w:rPr>
+      </w:pPr>
+      <w:r>
+        <w:rPr>
+          <w:lang w:val="en-AU"/>
+        </w:rPr>
+        <w:t>Verify the appointment time follows a valid format such as 14:30.</w:t>
+      </w:r>
+    </w:p>
+    <w:p>
+      <w:pPr>
+        <w:rPr>
+          <w:lang w:val="en-AU"/>
+        </w:rPr>
+      </w:pPr>
+      <w:r>
+        <w:rPr>
+          <w:lang w:val="en-AU"/>
+        </w:rPr>
+        <w:t>This would improve data quality and reduce user errors.</w:t>
+      </w:r>
+    </w:p>
+    <w:p>
+      <w:pPr>
+        <w:rPr>
+          <w:b/>
+          <w:bCs/>
+          <w:lang w:val="en-AU"/>
+        </w:rPr>
+      </w:pPr>
+      <w:r>
+        <w:rPr>
+          <w:b/>
+          <w:bCs/>
+          <w:lang w:val="en-AU"/>
+        </w:rPr>
+        <w:t>Improvement 2: Prevent double bookings</w:t>
+      </w:r>
+    </w:p>
+    <w:p>
+      <w:pPr>
+        <w:rPr>
+          <w:lang w:val="en-AU"/>
+        </w:rPr>
+      </w:pPr>
+      <w:r>
+        <w:rPr>
+          <w:lang w:val="en-AU"/>
+        </w:rPr>
+        <w:t>Before adding a new appointment:</w:t>
+      </w:r>
+    </w:p>
+    <w:p>
+      <w:pPr>
+        <w:numPr>
+          <w:ilvl w:val="0"/>
+          <w:numId w:val="14"/>
+        </w:numPr>
+        <w:rPr>
+          <w:lang w:val="en-AU"/>
+        </w:rPr>
+      </w:pPr>
+      <w:r>
+        <w:rPr>
+          <w:lang w:val="en-AU"/>
+        </w:rPr>
+        <w:t>Search existing appointments.</w:t>
+      </w:r>
+    </w:p>
+    <w:p>
+      <w:pPr>
+        <w:numPr>
+          <w:ilvl w:val="0"/>
+          <w:numId w:val="14"/>
+        </w:numPr>
+        <w:rPr>
+          <w:lang w:val="en-AU"/>
+        </w:rPr>
+      </w:pPr>
+      <w:r>
+        <w:rPr>
+          <w:lang w:val="en-AU"/>
+        </w:rPr>
+        <w:t>Check whether the same practitioner already has a booking at the requested time.</w:t>
+      </w:r>
+    </w:p>
+    <w:p>
+      <w:pPr>
+        <w:rPr>
+          <w:lang w:val="en-AU"/>
+        </w:rPr>
+      </w:pPr>
+      <w:r>
+        <w:rPr>
+          <w:lang w:val="en-AU"/>
+        </w:rPr>
+        <w:t>This would make the system more realistic.</w:t>
+      </w:r>
+    </w:p>
+    <w:p>
+      <w:pPr>
+        <w:rPr>
+          <w:b/>
+          <w:bCs/>
+          <w:lang w:val="en-AU"/>
+        </w:rPr>
+      </w:pPr>
+      <w:r>
+        <w:rPr>
+          <w:b/>
+          <w:bCs/>
+          <w:lang w:val="en-AU"/>
+        </w:rPr>
+        <w:t>Improvement 3: Save bookings to a file</w:t>
+      </w:r>
+    </w:p>
+    <w:p>
+      <w:pPr>
+        <w:rPr>
+          <w:lang w:val="en-AU"/>
+        </w:rPr>
+      </w:pPr>
+      <w:r>
+        <w:rPr>
+          <w:lang w:val="en-AU"/>
+        </w:rPr>
+        <w:lastRenderedPageBreak/>
+        <w:t>The comments already indicate this idea:</w:t>
+      </w:r>
+    </w:p>
+    <w:p>
+      <w:pPr>
+        <w:rPr>
+          <w:lang w:val="en-AU"/>
+        </w:rPr>
+      </w:pPr>
+      <w:r>
+        <w:rPr>
+          <w:lang w:val="en-AU"/>
+        </w:rPr>
+        <w:t># Save appointments to csv file</w:t>
+      </w:r>
+    </w:p>
+    <w:p>
+      <w:pPr>
+        <w:rPr>
+          <w:lang w:val="en-AU"/>
+        </w:rPr>
+      </w:pPr>
+      <w:r>
+        <w:rPr>
+          <w:lang w:val="en-AU"/>
+        </w:rPr>
+        <w:t xml:space="preserve">Saving to a CSV file would allow appointments to persist after the program closes. </w:t>
+      </w:r>
+      <w:hyperlink r:id="rId17" w:history="1">
+        <w:r>
+          <w:rPr>
+            <w:rStyle w:val="Hyperlink"/>
+            <w:lang w:val="en-AU"/>
+          </w:rPr>
+          <w:t>[unicanberr...epoint.com]</w:t>
+        </w:r>
+      </w:hyperlink>
+    </w:p>
+    <w:p>
+      <w:pPr>
+        <w:rPr>
+          <w:b/>
+          <w:bCs/>
+          <w:lang w:val="en-AU"/>
+        </w:rPr>
+      </w:pPr>
+      <w:r>
+        <w:rPr>
+          <w:b/>
+          <w:bCs/>
+          <w:lang w:val="en-AU"/>
+        </w:rPr>
+        <w:t>Additional improvements</w:t>
+      </w:r>
+    </w:p>
+    <w:p>
+      <w:pPr>
+        <w:numPr>
+          <w:ilvl w:val="0"/>
+          <w:numId w:val="15"/>
+        </w:numPr>
+        <w:rPr>
+          <w:lang w:val="en-AU"/>
+        </w:rPr>
+      </w:pPr>
+      <w:r>
+        <w:rPr>
+          <w:lang w:val="en-AU"/>
+        </w:rPr>
+        <w:t>Add appointment IDs.</w:t>
+      </w:r>
+    </w:p>
+    <w:p>
+      <w:pPr>
+        <w:numPr>
+          <w:ilvl w:val="0"/>
+          <w:numId w:val="15"/>
+        </w:numPr>
+        <w:rPr>
+          <w:lang w:val="en-AU"/>
+        </w:rPr>
+      </w:pPr>
+      <w:r>
+        <w:rPr>
+          <w:lang w:val="en-AU"/>
+        </w:rPr>
+        <w:t>Allow searching for a patient's booking.</w:t>
+      </w:r>
+    </w:p>
+    <w:p>
+      <w:pPr>
+        <w:numPr>
+          <w:ilvl w:val="0"/>
+          <w:numId w:val="15"/>
+        </w:numPr>
+        <w:rPr>
+          <w:lang w:val="en-AU"/>
+        </w:rPr>
+      </w:pPr>
+      <w:r>
+        <w:rPr>
+          <w:lang w:val="en-AU"/>
+        </w:rPr>
+        <w:t>Allow editing or cancelling appointments.</w:t>
+      </w:r>
+    </w:p>
+    <w:p>
+      <w:pPr>
+        <w:numPr>
+          <w:ilvl w:val="0"/>
+          <w:numId w:val="15"/>
+        </w:numPr>
+        <w:rPr>
+          <w:lang w:val="en-AU"/>
+        </w:rPr>
+      </w:pPr>
+      <w:r>
+        <w:rPr>
+          <w:lang w:val="en-AU"/>
+        </w:rPr>
+        <w:t>Sort appointments by date and time.</w:t>
+      </w:r>
+    </w:p>
+    <w:p>
+      <w:pPr>
+        <w:numPr>
+          <w:ilvl w:val="0"/>
+          <w:numId w:val="15"/>
+        </w:numPr>
+        <w:rPr>
+          <w:lang w:val="en-AU"/>
+        </w:rPr>
+      </w:pPr>
+      <w:r>
+        <w:rPr>
+          <w:lang w:val="en-AU"/>
+        </w:rPr>
+        <w:t>Handle errors with user-friendly messages rather than program crashes.</w:t>
+      </w:r>
+    </w:p>
+    <w:p>
+      <w:pPr>
+        <w:rPr>
+          <w:lang w:val="en-AU"/>
+        </w:rPr>
+      </w:pPr>
+      <w:r>
+        <w:rPr>
+          <w:lang w:val="en-AU"/>
+        </w:rPr>
+        <w:pict w14:anchorId="223AC45B">
+          <v:rect id="_x0000_i1045" style="width:0;height:1.5pt" o:hralign="center" o:hrstd="t" o:hr="t" fillcolor="#a0a0a0" stroked="f"/>
+        </w:pict>
+      </w:r>
+    </w:p>
+    <w:p>
+      <w:pPr>
+        <w:rPr>
+          <w:b/>
+          <w:bCs/>
+          <w:lang w:val="en-AU"/>
+        </w:rPr>
+      </w:pPr>
+      <w:r>
+        <w:rPr>
+          <w:b/>
+          <w:bCs/>
+          <w:lang w:val="en-AU"/>
+        </w:rPr>
+        <w:t>4. Summary</w:t>
+      </w:r>
+    </w:p>
+    <w:p>
+      <w:pPr>
+        <w:rPr>
+          <w:lang w:val="en-AU"/>
+        </w:rPr>
+      </w:pPr>
+      <w:r>
+        <w:rPr>
+          <w:lang w:val="en-AU"/>
+        </w:rPr>
+        <w:t>The program demonstrates several important introductory Python concepts:</w:t>
+      </w:r>
+    </w:p>
+    <w:p>
+      <w:pPr>
+        <w:numPr>
+          <w:ilvl w:val="0"/>
+          <w:numId w:val="16"/>
+        </w:numPr>
+        <w:rPr>
+          <w:lang w:val="en-AU"/>
+        </w:rPr>
+      </w:pPr>
+      <w:r>
+        <w:rPr>
+          <w:lang w:val="en-AU"/>
+        </w:rPr>
+        <w:t>Lists</w:t>
+      </w:r>
+    </w:p>
+    <w:p>
+      <w:pPr>
+        <w:numPr>
+          <w:ilvl w:val="0"/>
+          <w:numId w:val="16"/>
+        </w:numPr>
+        <w:rPr>
+          <w:lang w:val="en-AU"/>
+        </w:rPr>
+      </w:pPr>
+      <w:r>
+        <w:rPr>
+          <w:lang w:val="en-AU"/>
+        </w:rPr>
+        <w:t>Dictionaries</w:t>
+      </w:r>
+    </w:p>
+    <w:p>
+      <w:pPr>
+        <w:numPr>
+          <w:ilvl w:val="0"/>
+          <w:numId w:val="16"/>
+        </w:numPr>
+        <w:rPr>
+          <w:lang w:val="en-AU"/>
+        </w:rPr>
+      </w:pPr>
+      <w:r>
+        <w:rPr>
+          <w:lang w:val="en-AU"/>
+        </w:rPr>
+        <w:t>Functions</w:t>
+      </w:r>
+    </w:p>
+    <w:p>
+      <w:pPr>
+        <w:numPr>
+          <w:ilvl w:val="0"/>
+          <w:numId w:val="16"/>
+        </w:numPr>
+        <w:rPr>
+          <w:lang w:val="en-AU"/>
+        </w:rPr>
+      </w:pPr>
+      <w:r>
+        <w:rPr>
+          <w:lang w:val="en-AU"/>
+        </w:rPr>
+        <w:t>Loops</w:t>
+      </w:r>
+    </w:p>
+    <w:p>
+      <w:pPr>
+        <w:numPr>
+          <w:ilvl w:val="0"/>
+          <w:numId w:val="16"/>
+        </w:numPr>
+        <w:rPr>
+          <w:lang w:val="en-AU"/>
+        </w:rPr>
+      </w:pPr>
+      <w:r>
+        <w:rPr>
+          <w:lang w:val="en-AU"/>
+        </w:rPr>
+        <w:t>Conditional statements (if, elif, else)</w:t>
+      </w:r>
+    </w:p>
+    <w:p>
+      <w:pPr>
+        <w:numPr>
+          <w:ilvl w:val="0"/>
+          <w:numId w:val="16"/>
+        </w:numPr>
+        <w:rPr>
+          <w:lang w:val="en-AU"/>
+        </w:rPr>
+      </w:pPr>
+      <w:r>
+        <w:rPr>
+          <w:lang w:val="en-AU"/>
+        </w:rPr>
+        <w:t>User input (input())</w:t>
+      </w:r>
+    </w:p>
+    <w:p>
+      <w:pPr>
+        <w:numPr>
+          <w:ilvl w:val="0"/>
+          <w:numId w:val="16"/>
+        </w:numPr>
+        <w:rPr>
+          <w:lang w:val="en-AU"/>
+        </w:rPr>
+      </w:pPr>
+      <w:r>
+        <w:rPr>
+          <w:lang w:val="en-AU"/>
+        </w:rPr>
+        <w:t>Basic validation with ValueError</w:t>
+      </w:r>
+    </w:p>
+    <w:p>
+      <w:pPr>
+        <w:rPr>
+          <w:lang w:val="en-AU"/>
+        </w:rPr>
+      </w:pPr>
+      <w:r>
+        <w:rPr>
+          <w:lang w:val="en-AU"/>
+        </w:rPr>
+        <w:t xml:space="preserve">It works as a simple booking system but would benefit from stronger validation, data persistence, and scheduling checks. </w:t>
+      </w:r>
+      <w:hyperlink r:id="rId18" w:history="1">
+        <w:r>
+          <w:rPr>
+            <w:rStyle w:val="Hyperlink"/>
+            <w:lang w:val="en-AU"/>
+          </w:rPr>
+          <w:t>[unicanberr...epoint.com]</w:t>
+        </w:r>
+      </w:hyperlink>
+    </w:p>
+    <w:p>
+      <w:pPr>
+        <w:rPr>
+          <w:b/>
+          <w:bCs/>
+          <w:lang w:val="en-AU"/>
+        </w:rPr>
+      </w:pPr>
+      <w:r>
+        <w:rPr>
+          <w:b/>
+          <w:bCs/>
+          <w:lang w:val="en-AU"/>
+        </w:rPr>
+        <w:t>5. Questions to test your understanding</w:t>
+      </w:r>
+    </w:p>
+    <w:p>
+      <w:pPr>
+        <w:rPr>
+          <w:b/>
+          <w:bCs/>
+          <w:lang w:val="en-AU"/>
+        </w:rPr>
+      </w:pPr>
+      <w:r>
+        <w:rPr>
+          <w:b/>
+          <w:bCs/>
+          <w:lang w:val="en-AU"/>
+        </w:rPr>
+        <w:t>Question 1</w:t>
+      </w:r>
+    </w:p>
+    <w:p>
+      <w:pPr>
+        <w:rPr>
+          <w:lang w:val="en-AU"/>
+        </w:rPr>
+      </w:pPr>
+      <w:r>
+        <w:rPr>
+          <w:lang w:val="en-AU"/>
+        </w:rPr>
+        <w:t>Why is the appointments variable defined outside the functions, and how does that allow both book_appointment() and display_appointments() to use it?</w:t>
+      </w:r>
+    </w:p>
+    <w:p>
+      <w:pPr>
+        <w:rPr>
+          <w:b/>
+          <w:bCs/>
+          <w:lang w:val="en-AU"/>
+        </w:rPr>
+      </w:pPr>
+      <w:r>
+        <w:rPr>
+          <w:b/>
+          <w:bCs/>
+          <w:lang w:val="en-AU"/>
+        </w:rPr>
+        <w:t>Question 2</w:t>
+      </w:r>
+    </w:p>
+    <w:p>
+      <w:pPr>
+        <w:rPr>
+          <w:lang w:val="en-AU"/>
+        </w:rPr>
+      </w:pPr>
+      <w:r>
+        <w:rPr>
+          <w:lang w:val="en-AU"/>
+        </w:rPr>
+        <w:t>What happens when the user enters "3" at the menu, and why does the while True: loop stop running?</w:t>
+      </w:r>
+    </w:p>
+    <w:p/>
+    <w:p>
+      <w:pPr>
         <w:pStyle w:val="Heading1"/>
       </w:pPr>
       <w:r>
+        <w:lastRenderedPageBreak/>
         <w:t>Part D - Generate an Alternative: AI ON</w:t>
       </w:r>
     </w:p>
@@ -1103,13 +2810,21 @@
           <w:tcPr>
             <w:tcW w:w="3360" w:type="dxa"/>
           </w:tcPr>
-          <w:p/>
+          <w:p>
+            <w:r>
+              <w:t>Yes</w:t>
+            </w:r>
+          </w:p>
         </w:tc>
         <w:tc>
           <w:tcPr>
             <w:tcW w:w="3360" w:type="dxa"/>
           </w:tcPr>
-          <w:p/>
+          <w:p>
+            <w:r>
+              <w:t>Yes</w:t>
+            </w:r>
+          </w:p>
         </w:tc>
       </w:tr>
       <w:tr>
@@ -1127,13 +2842,21 @@
           <w:tcPr>
             <w:tcW w:w="3360" w:type="dxa"/>
           </w:tcPr>
-          <w:p/>
+          <w:p>
+            <w:r>
+              <w:t>Yes</w:t>
+            </w:r>
+          </w:p>
         </w:tc>
         <w:tc>
           <w:tcPr>
             <w:tcW w:w="3360" w:type="dxa"/>
           </w:tcPr>
-          <w:p/>
+          <w:p>
+            <w:r>
+              <w:t>No</w:t>
+            </w:r>
+          </w:p>
         </w:tc>
       </w:tr>
       <w:tr>
@@ -1151,13 +2874,21 @@
           <w:tcPr>
             <w:tcW w:w="3360" w:type="dxa"/>
           </w:tcPr>
-          <w:p/>
+          <w:p>
+            <w:r>
+              <w:t>Yes</w:t>
+            </w:r>
+          </w:p>
         </w:tc>
         <w:tc>
           <w:tcPr>
             <w:tcW w:w="3360" w:type="dxa"/>
           </w:tcPr>
-          <w:p/>
+          <w:p>
+            <w:r>
+              <w:t>Yes</w:t>
+            </w:r>
+          </w:p>
         </w:tc>
       </w:tr>
       <w:tr>
@@ -1175,13 +2906,21 @@
           <w:tcPr>
             <w:tcW w:w="3360" w:type="dxa"/>
           </w:tcPr>
-          <w:p/>
+          <w:p>
+            <w:r>
+              <w:t>Yes</w:t>
+            </w:r>
+          </w:p>
         </w:tc>
         <w:tc>
           <w:tcPr>
             <w:tcW w:w="3360" w:type="dxa"/>
           </w:tcPr>
-          <w:p/>
+          <w:p>
+            <w:r>
+              <w:t>No</w:t>
+            </w:r>
+          </w:p>
         </w:tc>
       </w:tr>
       <w:tr>
@@ -1199,13 +2938,21 @@
           <w:tcPr>
             <w:tcW w:w="3360" w:type="dxa"/>
           </w:tcPr>
-          <w:p/>
+          <w:p>
+            <w:r>
+              <w:t>No</w:t>
+            </w:r>
+          </w:p>
         </w:tc>
         <w:tc>
           <w:tcPr>
             <w:tcW w:w="3360" w:type="dxa"/>
           </w:tcPr>
-          <w:p/>
+          <w:p>
+            <w:r>
+              <w:t>No</w:t>
+            </w:r>
+          </w:p>
         </w:tc>
       </w:tr>
       <w:tr>
@@ -1223,13 +2970,21 @@
           <w:tcPr>
             <w:tcW w:w="3360" w:type="dxa"/>
           </w:tcPr>
-          <w:p/>
+          <w:p>
+            <w:r>
+              <w:t>Yes</w:t>
+            </w:r>
+          </w:p>
         </w:tc>
         <w:tc>
           <w:tcPr>
             <w:tcW w:w="3360" w:type="dxa"/>
           </w:tcPr>
-          <w:p/>
+          <w:p>
+            <w:r>
+              <w:t>Yes</w:t>
+            </w:r>
+          </w:p>
         </w:tc>
       </w:tr>
     </w:tbl>
@@ -1301,16 +3056,31 @@
     </w:p>
     <w:p>
       <w:r>
+        <w:t>The whole thing</w:t>
+      </w:r>
+    </w:p>
+    <w:p>
+      <w:r>
         <w:t>What did AI help you understand?</w:t>
       </w:r>
     </w:p>
     <w:p>
       <w:r>
+        <w:t>Nothing</w:t>
+      </w:r>
+    </w:p>
+    <w:p>
+      <w:r>
         <w:t>Did AI make assumptions?</w:t>
       </w:r>
     </w:p>
     <w:p>
       <w:r>
+        <w:t>Yes</w:t>
+      </w:r>
+    </w:p>
+    <w:p>
+      <w:r>
         <w:t>How did you verify the AI output?</w:t>
       </w:r>
     </w:p>
@@ -1320,10 +3090,16 @@
       </w:r>
     </w:p>
     <w:p>
+      <w:r>
+        <w:t>All of it</w:t>
+      </w:r>
+    </w:p>
+    <w:p>
       <w:pPr>
         <w:pStyle w:val="Heading1"/>
       </w:pPr>
       <w:r>
+        <w:lastRenderedPageBreak/>
         <w:t>Submission checklist</w:t>
       </w:r>
       <w:r>
@@ -1558,6 +3334,984 @@
       </w:pPr>
       <w:rPr>
         <w:rFonts w:ascii="Symbol" w:hAnsi="Symbol" w:hint="default"/>
+      </w:rPr>
+    </w:lvl>
+  </w:abstractNum>
+  <w:abstractNum w:abstractNumId="9" w15:restartNumberingAfterBreak="0">
+    <w:nsid w:val="0228599A"/>
+    <w:multiLevelType w:val="multilevel"/>
+    <w:tmpl w:val="7A0237BA"/>
+    <w:lvl w:ilvl="0">
+      <w:start w:val="1"/>
+      <w:numFmt w:val="bullet"/>
+      <w:lvlText w:val=""/>
+      <w:lvlJc w:val="left"/>
+      <w:pPr>
+        <w:tabs>
+          <w:tab w:val="num" w:pos="720"/>
+        </w:tabs>
+        <w:ind w:left="720" w:hanging="360"/>
+      </w:pPr>
+      <w:rPr>
+        <w:rFonts w:ascii="Symbol" w:hAnsi="Symbol" w:hint="default"/>
+        <w:sz w:val="20"/>
+      </w:rPr>
+    </w:lvl>
+    <w:lvl w:ilvl="1" w:tentative="1">
+      <w:start w:val="1"/>
+      <w:numFmt w:val="bullet"/>
+      <w:lvlText w:val="o"/>
+      <w:lvlJc w:val="left"/>
+      <w:pPr>
+        <w:tabs>
+          <w:tab w:val="num" w:pos="1440"/>
+        </w:tabs>
+        <w:ind w:left="1440" w:hanging="360"/>
+      </w:pPr>
+      <w:rPr>
+        <w:rFonts w:ascii="Courier New" w:hAnsi="Courier New" w:hint="default"/>
+        <w:sz w:val="20"/>
+      </w:rPr>
+    </w:lvl>
+    <w:lvl w:ilvl="2" w:tentative="1">
+      <w:start w:val="1"/>
+      <w:numFmt w:val="bullet"/>
+      <w:lvlText w:val=""/>
+      <w:lvlJc w:val="left"/>
+      <w:pPr>
+        <w:tabs>
+          <w:tab w:val="num" w:pos="2160"/>
+        </w:tabs>
+        <w:ind w:left="2160" w:hanging="360"/>
+      </w:pPr>
+      <w:rPr>
+        <w:rFonts w:ascii="Wingdings" w:hAnsi="Wingdings" w:hint="default"/>
+        <w:sz w:val="20"/>
+      </w:rPr>
+    </w:lvl>
+    <w:lvl w:ilvl="3" w:tentative="1">
+      <w:start w:val="1"/>
+      <w:numFmt w:val="bullet"/>
+      <w:lvlText w:val=""/>
+      <w:lvlJc w:val="left"/>
+      <w:pPr>
+        <w:tabs>
+          <w:tab w:val="num" w:pos="2880"/>
+        </w:tabs>
+        <w:ind w:left="2880" w:hanging="360"/>
+      </w:pPr>
+      <w:rPr>
+        <w:rFonts w:ascii="Wingdings" w:hAnsi="Wingdings" w:hint="default"/>
+        <w:sz w:val="20"/>
+      </w:rPr>
+    </w:lvl>
+    <w:lvl w:ilvl="4" w:tentative="1">
+      <w:start w:val="1"/>
+      <w:numFmt w:val="bullet"/>
+      <w:lvlText w:val=""/>
+      <w:lvlJc w:val="left"/>
+      <w:pPr>
+        <w:tabs>
+          <w:tab w:val="num" w:pos="3600"/>
+        </w:tabs>
+        <w:ind w:left="3600" w:hanging="360"/>
+      </w:pPr>
+      <w:rPr>
+        <w:rFonts w:ascii="Wingdings" w:hAnsi="Wingdings" w:hint="default"/>
+        <w:sz w:val="20"/>
+      </w:rPr>
+    </w:lvl>
+    <w:lvl w:ilvl="5" w:tentative="1">
+      <w:start w:val="1"/>
+      <w:numFmt w:val="bullet"/>
+      <w:lvlText w:val=""/>
+      <w:lvlJc w:val="left"/>
+      <w:pPr>
+        <w:tabs>
+          <w:tab w:val="num" w:pos="4320"/>
+        </w:tabs>
+        <w:ind w:left="4320" w:hanging="360"/>
+      </w:pPr>
+      <w:rPr>
+        <w:rFonts w:ascii="Wingdings" w:hAnsi="Wingdings" w:hint="default"/>
+        <w:sz w:val="20"/>
+      </w:rPr>
+    </w:lvl>
+    <w:lvl w:ilvl="6" w:tentative="1">
+      <w:start w:val="1"/>
+      <w:numFmt w:val="bullet"/>
+      <w:lvlText w:val=""/>
+      <w:lvlJc w:val="left"/>
+      <w:pPr>
+        <w:tabs>
+          <w:tab w:val="num" w:pos="5040"/>
+        </w:tabs>
+        <w:ind w:left="5040" w:hanging="360"/>
+      </w:pPr>
+      <w:rPr>
+        <w:rFonts w:ascii="Wingdings" w:hAnsi="Wingdings" w:hint="default"/>
+        <w:sz w:val="20"/>
+      </w:rPr>
+    </w:lvl>
+    <w:lvl w:ilvl="7" w:tentative="1">
+      <w:start w:val="1"/>
+      <w:numFmt w:val="bullet"/>
+      <w:lvlText w:val=""/>
+      <w:lvlJc w:val="left"/>
+      <w:pPr>
+        <w:tabs>
+          <w:tab w:val="num" w:pos="5760"/>
+        </w:tabs>
+        <w:ind w:left="5760" w:hanging="360"/>
+      </w:pPr>
+      <w:rPr>
+        <w:rFonts w:ascii="Wingdings" w:hAnsi="Wingdings" w:hint="default"/>
+        <w:sz w:val="20"/>
+      </w:rPr>
+    </w:lvl>
+    <w:lvl w:ilvl="8" w:tentative="1">
+      <w:start w:val="1"/>
+      <w:numFmt w:val="bullet"/>
+      <w:lvlText w:val=""/>
+      <w:lvlJc w:val="left"/>
+      <w:pPr>
+        <w:tabs>
+          <w:tab w:val="num" w:pos="6480"/>
+        </w:tabs>
+        <w:ind w:left="6480" w:hanging="360"/>
+      </w:pPr>
+      <w:rPr>
+        <w:rFonts w:ascii="Wingdings" w:hAnsi="Wingdings" w:hint="default"/>
+        <w:sz w:val="20"/>
+      </w:rPr>
+    </w:lvl>
+  </w:abstractNum>
+  <w:abstractNum w:abstractNumId="10" w15:restartNumberingAfterBreak="0">
+    <w:nsid w:val="06814299"/>
+    <w:multiLevelType w:val="multilevel"/>
+    <w:tmpl w:val="6586654C"/>
+    <w:lvl w:ilvl="0">
+      <w:start w:val="1"/>
+      <w:numFmt w:val="bullet"/>
+      <w:lvlText w:val=""/>
+      <w:lvlJc w:val="left"/>
+      <w:pPr>
+        <w:tabs>
+          <w:tab w:val="num" w:pos="720"/>
+        </w:tabs>
+        <w:ind w:left="720" w:hanging="360"/>
+      </w:pPr>
+      <w:rPr>
+        <w:rFonts w:ascii="Symbol" w:hAnsi="Symbol" w:hint="default"/>
+        <w:sz w:val="20"/>
+      </w:rPr>
+    </w:lvl>
+    <w:lvl w:ilvl="1" w:tentative="1">
+      <w:start w:val="1"/>
+      <w:numFmt w:val="bullet"/>
+      <w:lvlText w:val="o"/>
+      <w:lvlJc w:val="left"/>
+      <w:pPr>
+        <w:tabs>
+          <w:tab w:val="num" w:pos="1440"/>
+        </w:tabs>
+        <w:ind w:left="1440" w:hanging="360"/>
+      </w:pPr>
+      <w:rPr>
+        <w:rFonts w:ascii="Courier New" w:hAnsi="Courier New" w:hint="default"/>
+        <w:sz w:val="20"/>
+      </w:rPr>
+    </w:lvl>
+    <w:lvl w:ilvl="2" w:tentative="1">
+      <w:start w:val="1"/>
+      <w:numFmt w:val="bullet"/>
+      <w:lvlText w:val=""/>
+      <w:lvlJc w:val="left"/>
+      <w:pPr>
+        <w:tabs>
+          <w:tab w:val="num" w:pos="2160"/>
+        </w:tabs>
+        <w:ind w:left="2160" w:hanging="360"/>
+      </w:pPr>
+      <w:rPr>
+        <w:rFonts w:ascii="Wingdings" w:hAnsi="Wingdings" w:hint="default"/>
+        <w:sz w:val="20"/>
+      </w:rPr>
+    </w:lvl>
+    <w:lvl w:ilvl="3" w:tentative="1">
+      <w:start w:val="1"/>
+      <w:numFmt w:val="bullet"/>
+      <w:lvlText w:val=""/>
+      <w:lvlJc w:val="left"/>
+      <w:pPr>
+        <w:tabs>
+          <w:tab w:val="num" w:pos="2880"/>
+        </w:tabs>
+        <w:ind w:left="2880" w:hanging="360"/>
+      </w:pPr>
+      <w:rPr>
+        <w:rFonts w:ascii="Wingdings" w:hAnsi="Wingdings" w:hint="default"/>
+        <w:sz w:val="20"/>
+      </w:rPr>
+    </w:lvl>
+    <w:lvl w:ilvl="4" w:tentative="1">
+      <w:start w:val="1"/>
+      <w:numFmt w:val="bullet"/>
+      <w:lvlText w:val=""/>
+      <w:lvlJc w:val="left"/>
+      <w:pPr>
+        <w:tabs>
+          <w:tab w:val="num" w:pos="3600"/>
+        </w:tabs>
+        <w:ind w:left="3600" w:hanging="360"/>
+      </w:pPr>
+      <w:rPr>
+        <w:rFonts w:ascii="Wingdings" w:hAnsi="Wingdings" w:hint="default"/>
+        <w:sz w:val="20"/>
+      </w:rPr>
+    </w:lvl>
+    <w:lvl w:ilvl="5" w:tentative="1">
+      <w:start w:val="1"/>
+      <w:numFmt w:val="bullet"/>
+      <w:lvlText w:val=""/>
+      <w:lvlJc w:val="left"/>
+      <w:pPr>
+        <w:tabs>
+          <w:tab w:val="num" w:pos="4320"/>
+        </w:tabs>
+        <w:ind w:left="4320" w:hanging="360"/>
+      </w:pPr>
+      <w:rPr>
+        <w:rFonts w:ascii="Wingdings" w:hAnsi="Wingdings" w:hint="default"/>
+        <w:sz w:val="20"/>
+      </w:rPr>
+    </w:lvl>
+    <w:lvl w:ilvl="6" w:tentative="1">
+      <w:start w:val="1"/>
+      <w:numFmt w:val="bullet"/>
+      <w:lvlText w:val=""/>
+      <w:lvlJc w:val="left"/>
+      <w:pPr>
+        <w:tabs>
+          <w:tab w:val="num" w:pos="5040"/>
+        </w:tabs>
+        <w:ind w:left="5040" w:hanging="360"/>
+      </w:pPr>
+      <w:rPr>
+        <w:rFonts w:ascii="Wingdings" w:hAnsi="Wingdings" w:hint="default"/>
+        <w:sz w:val="20"/>
+      </w:rPr>
+    </w:lvl>
+    <w:lvl w:ilvl="7" w:tentative="1">
+      <w:start w:val="1"/>
+      <w:numFmt w:val="bullet"/>
+      <w:lvlText w:val=""/>
+      <w:lvlJc w:val="left"/>
+      <w:pPr>
+        <w:tabs>
+          <w:tab w:val="num" w:pos="5760"/>
+        </w:tabs>
+        <w:ind w:left="5760" w:hanging="360"/>
+      </w:pPr>
+      <w:rPr>
+        <w:rFonts w:ascii="Wingdings" w:hAnsi="Wingdings" w:hint="default"/>
+        <w:sz w:val="20"/>
+      </w:rPr>
+    </w:lvl>
+    <w:lvl w:ilvl="8" w:tentative="1">
+      <w:start w:val="1"/>
+      <w:numFmt w:val="bullet"/>
+      <w:lvlText w:val=""/>
+      <w:lvlJc w:val="left"/>
+      <w:pPr>
+        <w:tabs>
+          <w:tab w:val="num" w:pos="6480"/>
+        </w:tabs>
+        <w:ind w:left="6480" w:hanging="360"/>
+      </w:pPr>
+      <w:rPr>
+        <w:rFonts w:ascii="Wingdings" w:hAnsi="Wingdings" w:hint="default"/>
+        <w:sz w:val="20"/>
+      </w:rPr>
+    </w:lvl>
+  </w:abstractNum>
+  <w:abstractNum w:abstractNumId="11" w15:restartNumberingAfterBreak="0">
+    <w:nsid w:val="121440AD"/>
+    <w:multiLevelType w:val="multilevel"/>
+    <w:tmpl w:val="CA7EDEDC"/>
+    <w:lvl w:ilvl="0">
+      <w:start w:val="1"/>
+      <w:numFmt w:val="bullet"/>
+      <w:lvlText w:val=""/>
+      <w:lvlJc w:val="left"/>
+      <w:pPr>
+        <w:tabs>
+          <w:tab w:val="num" w:pos="720"/>
+        </w:tabs>
+        <w:ind w:left="720" w:hanging="360"/>
+      </w:pPr>
+      <w:rPr>
+        <w:rFonts w:ascii="Symbol" w:hAnsi="Symbol" w:hint="default"/>
+        <w:sz w:val="20"/>
+      </w:rPr>
+    </w:lvl>
+    <w:lvl w:ilvl="1" w:tentative="1">
+      <w:start w:val="1"/>
+      <w:numFmt w:val="bullet"/>
+      <w:lvlText w:val="o"/>
+      <w:lvlJc w:val="left"/>
+      <w:pPr>
+        <w:tabs>
+          <w:tab w:val="num" w:pos="1440"/>
+        </w:tabs>
+        <w:ind w:left="1440" w:hanging="360"/>
+      </w:pPr>
+      <w:rPr>
+        <w:rFonts w:ascii="Courier New" w:hAnsi="Courier New" w:hint="default"/>
+        <w:sz w:val="20"/>
+      </w:rPr>
+    </w:lvl>
+    <w:lvl w:ilvl="2" w:tentative="1">
+      <w:start w:val="1"/>
+      <w:numFmt w:val="bullet"/>
+      <w:lvlText w:val=""/>
+      <w:lvlJc w:val="left"/>
+      <w:pPr>
+        <w:tabs>
+          <w:tab w:val="num" w:pos="2160"/>
+        </w:tabs>
+        <w:ind w:left="2160" w:hanging="360"/>
+      </w:pPr>
+      <w:rPr>
+        <w:rFonts w:ascii="Wingdings" w:hAnsi="Wingdings" w:hint="default"/>
+        <w:sz w:val="20"/>
+      </w:rPr>
+    </w:lvl>
+    <w:lvl w:ilvl="3" w:tentative="1">
+      <w:start w:val="1"/>
+      <w:numFmt w:val="bullet"/>
+      <w:lvlText w:val=""/>
+      <w:lvlJc w:val="left"/>
+      <w:pPr>
+        <w:tabs>
+          <w:tab w:val="num" w:pos="2880"/>
+        </w:tabs>
+        <w:ind w:left="2880" w:hanging="360"/>
+      </w:pPr>
+      <w:rPr>
+        <w:rFonts w:ascii="Wingdings" w:hAnsi="Wingdings" w:hint="default"/>
+        <w:sz w:val="20"/>
+      </w:rPr>
+    </w:lvl>
+    <w:lvl w:ilvl="4" w:tentative="1">
+      <w:start w:val="1"/>
+      <w:numFmt w:val="bullet"/>
+      <w:lvlText w:val=""/>
+      <w:lvlJc w:val="left"/>
+      <w:pPr>
+        <w:tabs>
+          <w:tab w:val="num" w:pos="3600"/>
+        </w:tabs>
+        <w:ind w:left="3600" w:hanging="360"/>
+      </w:pPr>
+      <w:rPr>
+        <w:rFonts w:ascii="Wingdings" w:hAnsi="Wingdings" w:hint="default"/>
+        <w:sz w:val="20"/>
+      </w:rPr>
+    </w:lvl>
+    <w:lvl w:ilvl="5" w:tentative="1">
+      <w:start w:val="1"/>
+      <w:numFmt w:val="bullet"/>
+      <w:lvlText w:val=""/>
+      <w:lvlJc w:val="left"/>
+      <w:pPr>
+        <w:tabs>
+          <w:tab w:val="num" w:pos="4320"/>
+        </w:tabs>
+        <w:ind w:left="4320" w:hanging="360"/>
+      </w:pPr>
+      <w:rPr>
+        <w:rFonts w:ascii="Wingdings" w:hAnsi="Wingdings" w:hint="default"/>
+        <w:sz w:val="20"/>
+      </w:rPr>
+    </w:lvl>
+    <w:lvl w:ilvl="6" w:tentative="1">
+      <w:start w:val="1"/>
+      <w:numFmt w:val="bullet"/>
+      <w:lvlText w:val=""/>
+      <w:lvlJc w:val="left"/>
+      <w:pPr>
+        <w:tabs>
+          <w:tab w:val="num" w:pos="5040"/>
+        </w:tabs>
+        <w:ind w:left="5040" w:hanging="360"/>
+      </w:pPr>
+      <w:rPr>
+        <w:rFonts w:ascii="Wingdings" w:hAnsi="Wingdings" w:hint="default"/>
+        <w:sz w:val="20"/>
+      </w:rPr>
+    </w:lvl>
+    <w:lvl w:ilvl="7" w:tentative="1">
+      <w:start w:val="1"/>
+      <w:numFmt w:val="bullet"/>
+      <w:lvlText w:val=""/>
+      <w:lvlJc w:val="left"/>
+      <w:pPr>
+        <w:tabs>
+          <w:tab w:val="num" w:pos="5760"/>
+        </w:tabs>
+        <w:ind w:left="5760" w:hanging="360"/>
+      </w:pPr>
+      <w:rPr>
+        <w:rFonts w:ascii="Wingdings" w:hAnsi="Wingdings" w:hint="default"/>
+        <w:sz w:val="20"/>
+      </w:rPr>
+    </w:lvl>
+    <w:lvl w:ilvl="8" w:tentative="1">
+      <w:start w:val="1"/>
+      <w:numFmt w:val="bullet"/>
+      <w:lvlText w:val=""/>
+      <w:lvlJc w:val="left"/>
+      <w:pPr>
+        <w:tabs>
+          <w:tab w:val="num" w:pos="6480"/>
+        </w:tabs>
+        <w:ind w:left="6480" w:hanging="360"/>
+      </w:pPr>
+      <w:rPr>
+        <w:rFonts w:ascii="Wingdings" w:hAnsi="Wingdings" w:hint="default"/>
+        <w:sz w:val="20"/>
+      </w:rPr>
+    </w:lvl>
+  </w:abstractNum>
+  <w:abstractNum w:abstractNumId="12" w15:restartNumberingAfterBreak="0">
+    <w:nsid w:val="20104676"/>
+    <w:multiLevelType w:val="multilevel"/>
+    <w:tmpl w:val="A79EE6F4"/>
+    <w:lvl w:ilvl="0">
+      <w:start w:val="1"/>
+      <w:numFmt w:val="bullet"/>
+      <w:lvlText w:val=""/>
+      <w:lvlJc w:val="left"/>
+      <w:pPr>
+        <w:tabs>
+          <w:tab w:val="num" w:pos="720"/>
+        </w:tabs>
+        <w:ind w:left="720" w:hanging="360"/>
+      </w:pPr>
+      <w:rPr>
+        <w:rFonts w:ascii="Symbol" w:hAnsi="Symbol" w:hint="default"/>
+        <w:sz w:val="20"/>
+      </w:rPr>
+    </w:lvl>
+    <w:lvl w:ilvl="1" w:tentative="1">
+      <w:start w:val="1"/>
+      <w:numFmt w:val="bullet"/>
+      <w:lvlText w:val="o"/>
+      <w:lvlJc w:val="left"/>
+      <w:pPr>
+        <w:tabs>
+          <w:tab w:val="num" w:pos="1440"/>
+        </w:tabs>
+        <w:ind w:left="1440" w:hanging="360"/>
+      </w:pPr>
+      <w:rPr>
+        <w:rFonts w:ascii="Courier New" w:hAnsi="Courier New" w:hint="default"/>
+        <w:sz w:val="20"/>
+      </w:rPr>
+    </w:lvl>
+    <w:lvl w:ilvl="2" w:tentative="1">
+      <w:start w:val="1"/>
+      <w:numFmt w:val="bullet"/>
+      <w:lvlText w:val=""/>
+      <w:lvlJc w:val="left"/>
+      <w:pPr>
+        <w:tabs>
+          <w:tab w:val="num" w:pos="2160"/>
+        </w:tabs>
+        <w:ind w:left="2160" w:hanging="360"/>
+      </w:pPr>
+      <w:rPr>
+        <w:rFonts w:ascii="Wingdings" w:hAnsi="Wingdings" w:hint="default"/>
+        <w:sz w:val="20"/>
+      </w:rPr>
+    </w:lvl>
+    <w:lvl w:ilvl="3" w:tentative="1">
+      <w:start w:val="1"/>
+      <w:numFmt w:val="bullet"/>
+      <w:lvlText w:val=""/>
+      <w:lvlJc w:val="left"/>
+      <w:pPr>
+        <w:tabs>
+          <w:tab w:val="num" w:pos="2880"/>
+        </w:tabs>
+        <w:ind w:left="2880" w:hanging="360"/>
+      </w:pPr>
+      <w:rPr>
+        <w:rFonts w:ascii="Wingdings" w:hAnsi="Wingdings" w:hint="default"/>
+        <w:sz w:val="20"/>
+      </w:rPr>
+    </w:lvl>
+    <w:lvl w:ilvl="4" w:tentative="1">
+      <w:start w:val="1"/>
+      <w:numFmt w:val="bullet"/>
+      <w:lvlText w:val=""/>
+      <w:lvlJc w:val="left"/>
+      <w:pPr>
+        <w:tabs>
+          <w:tab w:val="num" w:pos="3600"/>
+        </w:tabs>
+        <w:ind w:left="3600" w:hanging="360"/>
+      </w:pPr>
+      <w:rPr>
+        <w:rFonts w:ascii="Wingdings" w:hAnsi="Wingdings" w:hint="default"/>
+        <w:sz w:val="20"/>
+      </w:rPr>
+    </w:lvl>
+    <w:lvl w:ilvl="5" w:tentative="1">
+      <w:start w:val="1"/>
+      <w:numFmt w:val="bullet"/>
+      <w:lvlText w:val=""/>
+      <w:lvlJc w:val="left"/>
+      <w:pPr>
+        <w:tabs>
+          <w:tab w:val="num" w:pos="4320"/>
+        </w:tabs>
+        <w:ind w:left="4320" w:hanging="360"/>
+      </w:pPr>
+      <w:rPr>
+        <w:rFonts w:ascii="Wingdings" w:hAnsi="Wingdings" w:hint="default"/>
+        <w:sz w:val="20"/>
+      </w:rPr>
+    </w:lvl>
+    <w:lvl w:ilvl="6" w:tentative="1">
+      <w:start w:val="1"/>
+      <w:numFmt w:val="bullet"/>
+      <w:lvlText w:val=""/>
+      <w:lvlJc w:val="left"/>
+      <w:pPr>
+        <w:tabs>
+          <w:tab w:val="num" w:pos="5040"/>
+        </w:tabs>
+        <w:ind w:left="5040" w:hanging="360"/>
+      </w:pPr>
+      <w:rPr>
+        <w:rFonts w:ascii="Wingdings" w:hAnsi="Wingdings" w:hint="default"/>
+        <w:sz w:val="20"/>
+      </w:rPr>
+    </w:lvl>
+    <w:lvl w:ilvl="7" w:tentative="1">
+      <w:start w:val="1"/>
+      <w:numFmt w:val="bullet"/>
+      <w:lvlText w:val=""/>
+      <w:lvlJc w:val="left"/>
+      <w:pPr>
+        <w:tabs>
+          <w:tab w:val="num" w:pos="5760"/>
+        </w:tabs>
+        <w:ind w:left="5760" w:hanging="360"/>
+      </w:pPr>
+      <w:rPr>
+        <w:rFonts w:ascii="Wingdings" w:hAnsi="Wingdings" w:hint="default"/>
+        <w:sz w:val="20"/>
+      </w:rPr>
+    </w:lvl>
+    <w:lvl w:ilvl="8" w:tentative="1">
+      <w:start w:val="1"/>
+      <w:numFmt w:val="bullet"/>
+      <w:lvlText w:val=""/>
+      <w:lvlJc w:val="left"/>
+      <w:pPr>
+        <w:tabs>
+          <w:tab w:val="num" w:pos="6480"/>
+        </w:tabs>
+        <w:ind w:left="6480" w:hanging="360"/>
+      </w:pPr>
+      <w:rPr>
+        <w:rFonts w:ascii="Wingdings" w:hAnsi="Wingdings" w:hint="default"/>
+        <w:sz w:val="20"/>
+      </w:rPr>
+    </w:lvl>
+  </w:abstractNum>
+  <w:abstractNum w:abstractNumId="13" w15:restartNumberingAfterBreak="0">
+    <w:nsid w:val="22542F33"/>
+    <w:multiLevelType w:val="multilevel"/>
+    <w:tmpl w:val="F0BE493C"/>
+    <w:lvl w:ilvl="0">
+      <w:start w:val="1"/>
+      <w:numFmt w:val="bullet"/>
+      <w:lvlText w:val=""/>
+      <w:lvlJc w:val="left"/>
+      <w:pPr>
+        <w:tabs>
+          <w:tab w:val="num" w:pos="720"/>
+        </w:tabs>
+        <w:ind w:left="720" w:hanging="360"/>
+      </w:pPr>
+      <w:rPr>
+        <w:rFonts w:ascii="Symbol" w:hAnsi="Symbol" w:hint="default"/>
+        <w:sz w:val="20"/>
+      </w:rPr>
+    </w:lvl>
+    <w:lvl w:ilvl="1" w:tentative="1">
+      <w:start w:val="1"/>
+      <w:numFmt w:val="bullet"/>
+      <w:lvlText w:val="o"/>
+      <w:lvlJc w:val="left"/>
+      <w:pPr>
+        <w:tabs>
+          <w:tab w:val="num" w:pos="1440"/>
+        </w:tabs>
+        <w:ind w:left="1440" w:hanging="360"/>
+      </w:pPr>
+      <w:rPr>
+        <w:rFonts w:ascii="Courier New" w:hAnsi="Courier New" w:hint="default"/>
+        <w:sz w:val="20"/>
+      </w:rPr>
+    </w:lvl>
+    <w:lvl w:ilvl="2" w:tentative="1">
+      <w:start w:val="1"/>
+      <w:numFmt w:val="bullet"/>
+      <w:lvlText w:val=""/>
+      <w:lvlJc w:val="left"/>
+      <w:pPr>
+        <w:tabs>
+          <w:tab w:val="num" w:pos="2160"/>
+        </w:tabs>
+        <w:ind w:left="2160" w:hanging="360"/>
+      </w:pPr>
+      <w:rPr>
+        <w:rFonts w:ascii="Wingdings" w:hAnsi="Wingdings" w:hint="default"/>
+        <w:sz w:val="20"/>
+      </w:rPr>
+    </w:lvl>
+    <w:lvl w:ilvl="3" w:tentative="1">
+      <w:start w:val="1"/>
+      <w:numFmt w:val="bullet"/>
+      <w:lvlText w:val=""/>
+      <w:lvlJc w:val="left"/>
+      <w:pPr>
+        <w:tabs>
+          <w:tab w:val="num" w:pos="2880"/>
+        </w:tabs>
+        <w:ind w:left="2880" w:hanging="360"/>
+      </w:pPr>
+      <w:rPr>
+        <w:rFonts w:ascii="Wingdings" w:hAnsi="Wingdings" w:hint="default"/>
+        <w:sz w:val="20"/>
+      </w:rPr>
+    </w:lvl>
+    <w:lvl w:ilvl="4" w:tentative="1">
+      <w:start w:val="1"/>
+      <w:numFmt w:val="bullet"/>
+      <w:lvlText w:val=""/>
+      <w:lvlJc w:val="left"/>
+      <w:pPr>
+        <w:tabs>
+          <w:tab w:val="num" w:pos="3600"/>
+        </w:tabs>
+        <w:ind w:left="3600" w:hanging="360"/>
+      </w:pPr>
+      <w:rPr>
+        <w:rFonts w:ascii="Wingdings" w:hAnsi="Wingdings" w:hint="default"/>
+        <w:sz w:val="20"/>
+      </w:rPr>
+    </w:lvl>
+    <w:lvl w:ilvl="5" w:tentative="1">
+      <w:start w:val="1"/>
+      <w:numFmt w:val="bullet"/>
+      <w:lvlText w:val=""/>
+      <w:lvlJc w:val="left"/>
+      <w:pPr>
+        <w:tabs>
+          <w:tab w:val="num" w:pos="4320"/>
+        </w:tabs>
+        <w:ind w:left="4320" w:hanging="360"/>
+      </w:pPr>
+      <w:rPr>
+        <w:rFonts w:ascii="Wingdings" w:hAnsi="Wingdings" w:hint="default"/>
+        <w:sz w:val="20"/>
+      </w:rPr>
+    </w:lvl>
+    <w:lvl w:ilvl="6" w:tentative="1">
+      <w:start w:val="1"/>
+      <w:numFmt w:val="bullet"/>
+      <w:lvlText w:val=""/>
+      <w:lvlJc w:val="left"/>
+      <w:pPr>
+        <w:tabs>
+          <w:tab w:val="num" w:pos="5040"/>
+        </w:tabs>
+        <w:ind w:left="5040" w:hanging="360"/>
+      </w:pPr>
+      <w:rPr>
+        <w:rFonts w:ascii="Wingdings" w:hAnsi="Wingdings" w:hint="default"/>
+        <w:sz w:val="20"/>
+      </w:rPr>
+    </w:lvl>
+    <w:lvl w:ilvl="7" w:tentative="1">
+      <w:start w:val="1"/>
+      <w:numFmt w:val="bullet"/>
+      <w:lvlText w:val=""/>
+      <w:lvlJc w:val="left"/>
+      <w:pPr>
+        <w:tabs>
+          <w:tab w:val="num" w:pos="5760"/>
+        </w:tabs>
+        <w:ind w:left="5760" w:hanging="360"/>
+      </w:pPr>
+      <w:rPr>
+        <w:rFonts w:ascii="Wingdings" w:hAnsi="Wingdings" w:hint="default"/>
+        <w:sz w:val="20"/>
+      </w:rPr>
+    </w:lvl>
+    <w:lvl w:ilvl="8" w:tentative="1">
+      <w:start w:val="1"/>
+      <w:numFmt w:val="bullet"/>
+      <w:lvlText w:val=""/>
+      <w:lvlJc w:val="left"/>
+      <w:pPr>
+        <w:tabs>
+          <w:tab w:val="num" w:pos="6480"/>
+        </w:tabs>
+        <w:ind w:left="6480" w:hanging="360"/>
+      </w:pPr>
+      <w:rPr>
+        <w:rFonts w:ascii="Wingdings" w:hAnsi="Wingdings" w:hint="default"/>
+        <w:sz w:val="20"/>
+      </w:rPr>
+    </w:lvl>
+  </w:abstractNum>
+  <w:abstractNum w:abstractNumId="14" w15:restartNumberingAfterBreak="0">
+    <w:nsid w:val="4D86621D"/>
+    <w:multiLevelType w:val="multilevel"/>
+    <w:tmpl w:val="5BB2418E"/>
+    <w:lvl w:ilvl="0">
+      <w:start w:val="1"/>
+      <w:numFmt w:val="decimal"/>
+      <w:lvlText w:val="%1."/>
+      <w:lvlJc w:val="left"/>
+      <w:pPr>
+        <w:tabs>
+          <w:tab w:val="num" w:pos="720"/>
+        </w:tabs>
+        <w:ind w:left="720" w:hanging="360"/>
+      </w:pPr>
+    </w:lvl>
+    <w:lvl w:ilvl="1">
+      <w:start w:val="1"/>
+      <w:numFmt w:val="bullet"/>
+      <w:lvlText w:val="o"/>
+      <w:lvlJc w:val="left"/>
+      <w:pPr>
+        <w:tabs>
+          <w:tab w:val="num" w:pos="1440"/>
+        </w:tabs>
+        <w:ind w:left="1440" w:hanging="360"/>
+      </w:pPr>
+      <w:rPr>
+        <w:rFonts w:ascii="Courier New" w:hAnsi="Courier New" w:hint="default"/>
+        <w:sz w:val="20"/>
+      </w:rPr>
+    </w:lvl>
+    <w:lvl w:ilvl="2">
+      <w:start w:val="1"/>
+      <w:numFmt w:val="bullet"/>
+      <w:lvlText w:val=""/>
+      <w:lvlJc w:val="left"/>
+      <w:pPr>
+        <w:tabs>
+          <w:tab w:val="num" w:pos="2160"/>
+        </w:tabs>
+        <w:ind w:left="2160" w:hanging="360"/>
+      </w:pPr>
+      <w:rPr>
+        <w:rFonts w:ascii="Wingdings" w:hAnsi="Wingdings" w:hint="default"/>
+        <w:sz w:val="20"/>
+      </w:rPr>
+    </w:lvl>
+    <w:lvl w:ilvl="3" w:tentative="1">
+      <w:start w:val="1"/>
+      <w:numFmt w:val="decimal"/>
+      <w:lvlText w:val="%4."/>
+      <w:lvlJc w:val="left"/>
+      <w:pPr>
+        <w:tabs>
+          <w:tab w:val="num" w:pos="2880"/>
+        </w:tabs>
+        <w:ind w:left="2880" w:hanging="360"/>
+      </w:pPr>
+    </w:lvl>
+    <w:lvl w:ilvl="4" w:tentative="1">
+      <w:start w:val="1"/>
+      <w:numFmt w:val="decimal"/>
+      <w:lvlText w:val="%5."/>
+      <w:lvlJc w:val="left"/>
+      <w:pPr>
+        <w:tabs>
+          <w:tab w:val="num" w:pos="3600"/>
+        </w:tabs>
+        <w:ind w:left="3600" w:hanging="360"/>
+      </w:pPr>
+    </w:lvl>
+    <w:lvl w:ilvl="5" w:tentative="1">
+      <w:start w:val="1"/>
+      <w:numFmt w:val="decimal"/>
+      <w:lvlText w:val="%6."/>
+      <w:lvlJc w:val="left"/>
+      <w:pPr>
+        <w:tabs>
+          <w:tab w:val="num" w:pos="4320"/>
+        </w:tabs>
+        <w:ind w:left="4320" w:hanging="360"/>
+      </w:pPr>
+    </w:lvl>
+    <w:lvl w:ilvl="6" w:tentative="1">
+      <w:start w:val="1"/>
+      <w:numFmt w:val="decimal"/>
+      <w:lvlText w:val="%7."/>
+      <w:lvlJc w:val="left"/>
+      <w:pPr>
+        <w:tabs>
+          <w:tab w:val="num" w:pos="5040"/>
+        </w:tabs>
+        <w:ind w:left="5040" w:hanging="360"/>
+      </w:pPr>
+    </w:lvl>
+    <w:lvl w:ilvl="7" w:tentative="1">
+      <w:start w:val="1"/>
+      <w:numFmt w:val="decimal"/>
+      <w:lvlText w:val="%8."/>
+      <w:lvlJc w:val="left"/>
+      <w:pPr>
+        <w:tabs>
+          <w:tab w:val="num" w:pos="5760"/>
+        </w:tabs>
+        <w:ind w:left="5760" w:hanging="360"/>
+      </w:pPr>
+    </w:lvl>
+    <w:lvl w:ilvl="8" w:tentative="1">
+      <w:start w:val="1"/>
+      <w:numFmt w:val="decimal"/>
+      <w:lvlText w:val="%9."/>
+      <w:lvlJc w:val="left"/>
+      <w:pPr>
+        <w:tabs>
+          <w:tab w:val="num" w:pos="6480"/>
+        </w:tabs>
+        <w:ind w:left="6480" w:hanging="360"/>
+      </w:pPr>
+    </w:lvl>
+  </w:abstractNum>
+  <w:abstractNum w:abstractNumId="15" w15:restartNumberingAfterBreak="0">
+    <w:nsid w:val="69A065C1"/>
+    <w:multiLevelType w:val="hybridMultilevel"/>
+    <w:tmpl w:val="FC6A02E0"/>
+    <w:lvl w:ilvl="0" w:tplc="1DEEA0D8">
+      <w:numFmt w:val="bullet"/>
+      <w:lvlText w:val="-"/>
+      <w:lvlJc w:val="left"/>
+      <w:pPr>
+        <w:ind w:left="720" w:hanging="360"/>
+      </w:pPr>
+      <w:rPr>
+        <w:rFonts w:ascii="Aptos" w:eastAsiaTheme="minorEastAsia" w:hAnsi="Aptos" w:cstheme="minorBidi" w:hint="default"/>
+      </w:rPr>
+    </w:lvl>
+    <w:lvl w:ilvl="1" w:tplc="0C090003" w:tentative="1">
+      <w:start w:val="1"/>
+      <w:numFmt w:val="bullet"/>
+      <w:lvlText w:val="o"/>
+      <w:lvlJc w:val="left"/>
+      <w:pPr>
+        <w:ind w:left="1440" w:hanging="360"/>
+      </w:pPr>
+      <w:rPr>
+        <w:rFonts w:ascii="Courier New" w:hAnsi="Courier New" w:cs="Courier New" w:hint="default"/>
+      </w:rPr>
+    </w:lvl>
+    <w:lvl w:ilvl="2" w:tplc="0C090005" w:tentative="1">
+      <w:start w:val="1"/>
+      <w:numFmt w:val="bullet"/>
+      <w:lvlText w:val=""/>
+      <w:lvlJc w:val="left"/>
+      <w:pPr>
+        <w:ind w:left="2160" w:hanging="360"/>
+      </w:pPr>
+      <w:rPr>
+        <w:rFonts w:ascii="Wingdings" w:hAnsi="Wingdings" w:hint="default"/>
+      </w:rPr>
+    </w:lvl>
+    <w:lvl w:ilvl="3" w:tplc="0C090001" w:tentative="1">
+      <w:start w:val="1"/>
+      <w:numFmt w:val="bullet"/>
+      <w:lvlText w:val=""/>
+      <w:lvlJc w:val="left"/>
+      <w:pPr>
+        <w:ind w:left="2880" w:hanging="360"/>
+      </w:pPr>
+      <w:rPr>
+        <w:rFonts w:ascii="Symbol" w:hAnsi="Symbol" w:hint="default"/>
+      </w:rPr>
+    </w:lvl>
+    <w:lvl w:ilvl="4" w:tplc="0C090003" w:tentative="1">
+      <w:start w:val="1"/>
+      <w:numFmt w:val="bullet"/>
+      <w:lvlText w:val="o"/>
+      <w:lvlJc w:val="left"/>
+      <w:pPr>
+        <w:ind w:left="3600" w:hanging="360"/>
+      </w:pPr>
+      <w:rPr>
+        <w:rFonts w:ascii="Courier New" w:hAnsi="Courier New" w:cs="Courier New" w:hint="default"/>
+      </w:rPr>
+    </w:lvl>
+    <w:lvl w:ilvl="5" w:tplc="0C090005" w:tentative="1">
+      <w:start w:val="1"/>
+      <w:numFmt w:val="bullet"/>
+      <w:lvlText w:val=""/>
+      <w:lvlJc w:val="left"/>
+      <w:pPr>
+        <w:ind w:left="4320" w:hanging="360"/>
+      </w:pPr>
+      <w:rPr>
+        <w:rFonts w:ascii="Wingdings" w:hAnsi="Wingdings" w:hint="default"/>
+      </w:rPr>
+    </w:lvl>
+    <w:lvl w:ilvl="6" w:tplc="0C090001" w:tentative="1">
+      <w:start w:val="1"/>
+      <w:numFmt w:val="bullet"/>
+      <w:lvlText w:val=""/>
+      <w:lvlJc w:val="left"/>
+      <w:pPr>
+        <w:ind w:left="5040" w:hanging="360"/>
+      </w:pPr>
+      <w:rPr>
+        <w:rFonts w:ascii="Symbol" w:hAnsi="Symbol" w:hint="default"/>
+      </w:rPr>
+    </w:lvl>
+    <w:lvl w:ilvl="7" w:tplc="0C090003" w:tentative="1">
+      <w:start w:val="1"/>
+      <w:numFmt w:val="bullet"/>
+      <w:lvlText w:val="o"/>
+      <w:lvlJc w:val="left"/>
+      <w:pPr>
+        <w:ind w:left="5760" w:hanging="360"/>
+      </w:pPr>
+      <w:rPr>
+        <w:rFonts w:ascii="Courier New" w:hAnsi="Courier New" w:cs="Courier New" w:hint="default"/>
+      </w:rPr>
+    </w:lvl>
+    <w:lvl w:ilvl="8" w:tplc="0C090005" w:tentative="1">
+      <w:start w:val="1"/>
+      <w:numFmt w:val="bullet"/>
+      <w:lvlText w:val=""/>
+      <w:lvlJc w:val="left"/>
+      <w:pPr>
+        <w:ind w:left="6480" w:hanging="360"/>
+      </w:pPr>
+      <w:rPr>
+        <w:rFonts w:ascii="Wingdings" w:hAnsi="Wingdings" w:hint="default"/>
       </w:rPr>
     </w:lvl>
   </w:abstractNum>
@@ -1587,6 +4341,27 @@
   </w:num>
   <w:num w:numId="9" w16cid:durableId="1202792164">
     <w:abstractNumId w:val="0"/>
+  </w:num>
+  <w:num w:numId="10" w16cid:durableId="397285714">
+    <w:abstractNumId w:val="15"/>
+  </w:num>
+  <w:num w:numId="11" w16cid:durableId="994534833">
+    <w:abstractNumId w:val="14"/>
+  </w:num>
+  <w:num w:numId="12" w16cid:durableId="736591570">
+    <w:abstractNumId w:val="9"/>
+  </w:num>
+  <w:num w:numId="13" w16cid:durableId="1029525559">
+    <w:abstractNumId w:val="10"/>
+  </w:num>
+  <w:num w:numId="14" w16cid:durableId="2095545342">
+    <w:abstractNumId w:val="13"/>
+  </w:num>
+  <w:num w:numId="15" w16cid:durableId="1445420608">
+    <w:abstractNumId w:val="12"/>
+  </w:num>
+  <w:num w:numId="16" w16cid:durableId="476263735">
+    <w:abstractNumId w:val="11"/>
   </w:num>
 </w:numbering>
 </file>
@@ -2198,7 +4973,6 @@
   <w:style w:type="character" w:default="1" w:styleId="DefaultParagraphFont">
     <w:name w:val="Default Paragraph Font"/>
     <w:uiPriority w:val="1"/>
-    <w:semiHidden/>
     <w:unhideWhenUsed/>
   </w:style>
   <w:style w:type="table" w:default="1" w:styleId="TableNormal">
@@ -12974,6 +15748,29 @@
         <w:shd w:val="clear" w:color="auto" w:fill="FBCAA2" w:themeFill="accent6" w:themeFillTint="7F"/>
       </w:tcPr>
     </w:tblStylePr>
+  </w:style>
+  <w:style w:type="character" w:styleId="Hyperlink">
+    <w:name w:val="Hyperlink"/>
+    <w:basedOn w:val="DefaultParagraphFont"/>
+    <w:uiPriority w:val="99"/>
+    <w:unhideWhenUsed/>
+    <w:rsid w:val="00215F29"/>
+    <w:rPr>
+      <w:color w:val="0000FF" w:themeColor="hyperlink"/>
+      <w:u w:val="single"/>
+    </w:rPr>
+  </w:style>
+  <w:style w:type="character" w:styleId="UnresolvedMention">
+    <w:name w:val="Unresolved Mention"/>
+    <w:basedOn w:val="DefaultParagraphFont"/>
+    <w:uiPriority w:val="99"/>
+    <w:semiHidden/>
+    <w:unhideWhenUsed/>
+    <w:rsid w:val="00215F29"/>
+    <w:rPr>
+      <w:color w:val="605E5C"/>
+      <w:shd w:val="clear" w:color="auto" w:fill="E1DFDD"/>
+    </w:rPr>
   </w:style>
 </w:styles>
 </file>

</xml_diff>